<commit_message>
Dynamic Quantization isn't supported for Convolutional layers in PyTorch
</commit_message>
<xml_diff>
--- a/Quantization Guide.docx
+++ b/Quantization Guide.docx
@@ -94,7 +94,21 @@
         <w:rPr>
           <w:lang w:val="en-US"/>
         </w:rPr>
-        <w:t>Dynamic quantization, also called runtime quantization, involves quantizing the model’s activations on-the-fly during inference which lets the model adapt to input data in real-time. Here typically only weights are pre-quantized, while activations are quantized dynamically.</w:t>
+        <w:t xml:space="preserve">Dynamic quantization, also called runtime quantization, involves quantizing the model’s activations on-the-fly during inference which lets the model adapt to input data in real-time. Here typically only weights are pre-quantized, while activations are </w:t>
+      </w:r>
+      <w:proofErr w:type="gramStart"/>
+      <w:r>
+        <w:rPr>
+          <w:lang w:val="en-US"/>
+        </w:rPr>
+        <w:t>quantized</w:t>
+      </w:r>
+      <w:proofErr w:type="gramEnd"/>
+      <w:r>
+        <w:rPr>
+          <w:lang w:val="en-US"/>
+        </w:rPr>
+        <w:t xml:space="preserve"> dynamically.</w:t>
       </w:r>
       <w:r>
         <w:rPr>
@@ -175,9 +189,183 @@
     <w:p>
       <w:pPr>
         <w:rPr>
-          <w:lang w:val="en-US"/>
-        </w:rPr>
-      </w:pPr>
+          <w:b/>
+          <w:bCs/>
+          <w:lang w:val="en-US"/>
+        </w:rPr>
+      </w:pPr>
+      <w:r>
+        <w:rPr>
+          <w:b/>
+          <w:bCs/>
+          <w:lang w:val="en-US"/>
+        </w:rPr>
+        <w:t>PyTorch Quantization:</w:t>
+      </w:r>
+    </w:p>
+    <w:p>
+      <w:pPr>
+        <w:rPr>
+          <w:b/>
+          <w:bCs/>
+          <w:i/>
+          <w:iCs/>
+          <w:lang w:val="en-US"/>
+        </w:rPr>
+      </w:pPr>
+      <w:r>
+        <w:rPr>
+          <w:b/>
+          <w:bCs/>
+          <w:lang w:val="en-US"/>
+        </w:rPr>
+        <w:t xml:space="preserve">To quantize a model in PyTorch we use </w:t>
+      </w:r>
+      <w:proofErr w:type="gramStart"/>
+      <w:r>
+        <w:rPr>
+          <w:b/>
+          <w:bCs/>
+          <w:lang w:val="en-US"/>
+        </w:rPr>
+        <w:t>torchao.quantization</w:t>
+      </w:r>
+      <w:proofErr w:type="gramEnd"/>
+      <w:r>
+        <w:rPr>
+          <w:b/>
+          <w:bCs/>
+          <w:lang w:val="en-US"/>
+        </w:rPr>
+        <w:t xml:space="preserve"> because </w:t>
+      </w:r>
+      <w:proofErr w:type="gramStart"/>
+      <w:r>
+        <w:rPr>
+          <w:b/>
+          <w:bCs/>
+          <w:lang w:val="en-US"/>
+        </w:rPr>
+        <w:t>torch.quantization</w:t>
+      </w:r>
+      <w:proofErr w:type="gramEnd"/>
+      <w:r>
+        <w:rPr>
+          <w:b/>
+          <w:bCs/>
+          <w:lang w:val="en-US"/>
+        </w:rPr>
+        <w:t xml:space="preserve"> has been deprecated. </w:t>
+      </w:r>
+      <w:proofErr w:type="gramStart"/>
+      <w:r>
+        <w:rPr>
+          <w:b/>
+          <w:bCs/>
+          <w:lang w:val="en-US"/>
+        </w:rPr>
+        <w:t>However</w:t>
+      </w:r>
+      <w:proofErr w:type="gramEnd"/>
+      <w:r>
+        <w:rPr>
+          <w:b/>
+          <w:bCs/>
+          <w:lang w:val="en-US"/>
+        </w:rPr>
+        <w:t xml:space="preserve"> the dynamic quantization in PyTorch doesn’t work for convolutional layers. For convolutional layers, the only thing that works is static quantization.</w:t>
+      </w:r>
+      <w:r>
+        <w:rPr>
+          <w:b/>
+          <w:bCs/>
+          <w:lang w:val="en-US"/>
+        </w:rPr>
+        <w:t xml:space="preserve"> </w:t>
+      </w:r>
+      <w:hyperlink r:id="rId4" w:history="1">
+        <w:r>
+          <w:rPr>
+            <w:rStyle w:val="Hyperlink"/>
+            <w:b/>
+            <w:bCs/>
+            <w:i/>
+            <w:iCs/>
+            <w:lang w:val="en-US"/>
+          </w:rPr>
+          <w:t>https://pytorch.org/docs/stable/quantization.html</w:t>
+        </w:r>
+      </w:hyperlink>
+    </w:p>
+    <w:p>
+      <w:pPr>
+        <w:rPr>
+          <w:b/>
+          <w:bCs/>
+          <w:i/>
+          <w:iCs/>
+          <w:lang w:val="en-US"/>
+        </w:rPr>
+      </w:pPr>
+      <w:r>
+        <w:rPr>
+          <w:b/>
+          <w:bCs/>
+          <w:i/>
+          <w:iCs/>
+          <w:lang w:val="en-US"/>
+        </w:rPr>
+        <w:t>https://pytorch.org/ao/stable/api_ref_quantization.html</w:t>
+      </w:r>
+    </w:p>
+    <w:p>
+      <w:pPr>
+        <w:rPr>
+          <w:b/>
+          <w:bCs/>
+          <w:lang w:val="en-US"/>
+        </w:rPr>
+      </w:pPr>
+      <w:r>
+        <w:rPr>
+          <w:noProof/>
+        </w:rPr>
+        <w:drawing>
+          <wp:inline distT="0" distB="0" distL="0" distR="0" wp14:anchorId="4397FA36" wp14:editId="6E51515F">
+            <wp:extent cx="5940425" cy="1765935"/>
+            <wp:effectExtent l="0" t="0" r="3175" b="5715"/>
+            <wp:docPr id="304526958" name="Picture 1" descr="A screenshot of a computer&#10;&#10;AI-generated content may be incorrect."/>
+            <wp:cNvGraphicFramePr>
+              <a:graphicFrameLocks xmlns:a="http://schemas.openxmlformats.org/drawingml/2006/main" noChangeAspect="1"/>
+            </wp:cNvGraphicFramePr>
+            <a:graphic xmlns:a="http://schemas.openxmlformats.org/drawingml/2006/main">
+              <a:graphicData uri="http://schemas.openxmlformats.org/drawingml/2006/picture">
+                <pic:pic xmlns:pic="http://schemas.openxmlformats.org/drawingml/2006/picture">
+                  <pic:nvPicPr>
+                    <pic:cNvPr id="304526958" name="Picture 1" descr="A screenshot of a computer&#10;&#10;AI-generated content may be incorrect."/>
+                    <pic:cNvPicPr/>
+                  </pic:nvPicPr>
+                  <pic:blipFill>
+                    <a:blip r:embed="rId5"/>
+                    <a:stretch>
+                      <a:fillRect/>
+                    </a:stretch>
+                  </pic:blipFill>
+                  <pic:spPr>
+                    <a:xfrm>
+                      <a:off x="0" y="0"/>
+                      <a:ext cx="5940425" cy="1765935"/>
+                    </a:xfrm>
+                    <a:prstGeom prst="rect">
+                      <a:avLst/>
+                    </a:prstGeom>
+                  </pic:spPr>
+                </pic:pic>
+              </a:graphicData>
+            </a:graphic>
+          </wp:inline>
+        </w:drawing>
+      </w:r>
     </w:p>
     <w:sectPr>
       <w:pgSz w:w="11906" w:h="16838"/>
@@ -792,6 +980,7 @@
   <w:style w:type="character" w:default="1" w:styleId="DefaultParagraphFont">
     <w:name w:val="Default Paragraph Font"/>
     <w:uiPriority w:val="1"/>
+    <w:semiHidden/>
     <w:unhideWhenUsed/>
   </w:style>
   <w:style w:type="table" w:default="1" w:styleId="TableNormal">
@@ -1103,6 +1292,29 @@
       <w:smallCaps/>
       <w:color w:val="0F4761" w:themeColor="accent1" w:themeShade="BF"/>
       <w:spacing w:val="5"/>
+    </w:rPr>
+  </w:style>
+  <w:style w:type="character" w:styleId="Hyperlink">
+    <w:name w:val="Hyperlink"/>
+    <w:basedOn w:val="DefaultParagraphFont"/>
+    <w:uiPriority w:val="99"/>
+    <w:unhideWhenUsed/>
+    <w:rsid w:val="009A26A9"/>
+    <w:rPr>
+      <w:color w:val="467886" w:themeColor="hyperlink"/>
+      <w:u w:val="single"/>
+    </w:rPr>
+  </w:style>
+  <w:style w:type="character" w:styleId="UnresolvedMention">
+    <w:name w:val="Unresolved Mention"/>
+    <w:basedOn w:val="DefaultParagraphFont"/>
+    <w:uiPriority w:val="99"/>
+    <w:semiHidden/>
+    <w:unhideWhenUsed/>
+    <w:rsid w:val="009A26A9"/>
+    <w:rPr>
+      <w:color w:val="605E5C"/>
+      <w:shd w:val="clear" w:color="auto" w:fill="E1DFDD"/>
     </w:rPr>
   </w:style>
 </w:styles>

</xml_diff>

<commit_message>
precision types for dynamic quantization besides int8 aren't supported
</commit_message>
<xml_diff>
--- a/Quantization Guide.docx
+++ b/Quantization Guide.docx
@@ -57,7 +57,21 @@
         <w:rPr>
           <w:lang w:val="en-US"/>
         </w:rPr>
-        <w:t xml:space="preserve"> For calibration, the only type supported by TensorRT is INT8 as of April 2025</w:t>
+        <w:t xml:space="preserve"> For calibration, the only type supported by </w:t>
+      </w:r>
+      <w:proofErr w:type="spellStart"/>
+      <w:r>
+        <w:rPr>
+          <w:lang w:val="en-US"/>
+        </w:rPr>
+        <w:t>TensorRT</w:t>
+      </w:r>
+      <w:proofErr w:type="spellEnd"/>
+      <w:r>
+        <w:rPr>
+          <w:lang w:val="en-US"/>
+        </w:rPr>
+        <w:t xml:space="preserve"> is INT8 as of April 2025</w:t>
       </w:r>
     </w:p>
     <w:p>
@@ -131,62 +145,94 @@
           <w:lang w:val="en-US"/>
         </w:rPr>
       </w:pPr>
-      <w:r>
-        <w:rPr>
-          <w:lang w:val="en-US"/>
-        </w:rPr>
-        <w:t xml:space="preserve">TensorRT Integration for Yolo: </w:t>
-      </w:r>
-      <w:r>
-        <w:rPr>
-          <w:lang w:val="en-US"/>
-        </w:rPr>
-        <w:t>docs.ultralytics.com/integrations/tensorrt/</w:t>
-      </w:r>
-    </w:p>
-    <w:p>
-      <w:pPr>
-        <w:rPr>
-          <w:lang w:val="en-US"/>
-        </w:rPr>
-      </w:pPr>
-    </w:p>
-    <w:p>
-      <w:pPr>
-        <w:rPr>
-          <w:lang w:val="en-US"/>
-        </w:rPr>
-      </w:pPr>
-    </w:p>
-    <w:p>
-      <w:pPr>
-        <w:rPr>
-          <w:lang w:val="en-US"/>
-        </w:rPr>
-      </w:pPr>
-    </w:p>
-    <w:p>
-      <w:pPr>
-        <w:rPr>
-          <w:lang w:val="en-US"/>
-        </w:rPr>
-      </w:pPr>
-    </w:p>
-    <w:p>
-      <w:pPr>
-        <w:rPr>
-          <w:b/>
-          <w:bCs/>
-          <w:lang w:val="en-US"/>
-        </w:rPr>
-      </w:pPr>
-      <w:r>
-        <w:rPr>
-          <w:b/>
-          <w:bCs/>
-          <w:lang w:val="en-US"/>
-        </w:rPr>
-        <w:t>PyTorch Quantization:</w:t>
+      <w:proofErr w:type="spellStart"/>
+      <w:r>
+        <w:rPr>
+          <w:lang w:val="en-US"/>
+        </w:rPr>
+        <w:t>TensorRT</w:t>
+      </w:r>
+      <w:proofErr w:type="spellEnd"/>
+      <w:r>
+        <w:rPr>
+          <w:lang w:val="en-US"/>
+        </w:rPr>
+        <w:t xml:space="preserve"> Integration for Yolo: </w:t>
+      </w:r>
+      <w:r>
+        <w:rPr>
+          <w:lang w:val="en-US"/>
+        </w:rPr>
+        <w:t>docs.ultralytics.com/integrations/</w:t>
+      </w:r>
+      <w:proofErr w:type="spellStart"/>
+      <w:r>
+        <w:rPr>
+          <w:lang w:val="en-US"/>
+        </w:rPr>
+        <w:t>tensorrt</w:t>
+      </w:r>
+      <w:proofErr w:type="spellEnd"/>
+      <w:r>
+        <w:rPr>
+          <w:lang w:val="en-US"/>
+        </w:rPr>
+        <w:t>/</w:t>
+      </w:r>
+    </w:p>
+    <w:p>
+      <w:pPr>
+        <w:rPr>
+          <w:lang w:val="en-US"/>
+        </w:rPr>
+      </w:pPr>
+    </w:p>
+    <w:p>
+      <w:pPr>
+        <w:rPr>
+          <w:lang w:val="en-US"/>
+        </w:rPr>
+      </w:pPr>
+    </w:p>
+    <w:p>
+      <w:pPr>
+        <w:rPr>
+          <w:lang w:val="en-US"/>
+        </w:rPr>
+      </w:pPr>
+    </w:p>
+    <w:p>
+      <w:pPr>
+        <w:rPr>
+          <w:lang w:val="en-US"/>
+        </w:rPr>
+      </w:pPr>
+    </w:p>
+    <w:p>
+      <w:pPr>
+        <w:rPr>
+          <w:b/>
+          <w:bCs/>
+          <w:lang w:val="en-US"/>
+        </w:rPr>
+      </w:pPr>
+      <w:proofErr w:type="spellStart"/>
+      <w:r>
+        <w:rPr>
+          <w:b/>
+          <w:bCs/>
+          <w:lang w:val="en-US"/>
+        </w:rPr>
+        <w:t>PyTorch</w:t>
+      </w:r>
+      <w:proofErr w:type="spellEnd"/>
+      <w:r>
+        <w:rPr>
+          <w:b/>
+          <w:bCs/>
+          <w:lang w:val="en-US"/>
+        </w:rPr>
+        <w:t xml:space="preserve"> Quantization:</w:t>
       </w:r>
     </w:p>
     <w:p>
@@ -204,7 +250,79 @@
           <w:bCs/>
           <w:lang w:val="en-US"/>
         </w:rPr>
-        <w:t>To quantize a model in PyTorch we use torchao.quantization because torch.quantization has been deprecated. However the dynamic quantization in PyTorch doesn’t work for convolutional layers. For convolutional layers, the only thing that works is static quantization.</w:t>
+        <w:t xml:space="preserve">To quantize a model in </w:t>
+      </w:r>
+      <w:proofErr w:type="spellStart"/>
+      <w:r>
+        <w:rPr>
+          <w:b/>
+          <w:bCs/>
+          <w:lang w:val="en-US"/>
+        </w:rPr>
+        <w:t>PyTorch</w:t>
+      </w:r>
+      <w:proofErr w:type="spellEnd"/>
+      <w:r>
+        <w:rPr>
+          <w:b/>
+          <w:bCs/>
+          <w:lang w:val="en-US"/>
+        </w:rPr>
+        <w:t xml:space="preserve"> we use </w:t>
+      </w:r>
+      <w:proofErr w:type="spellStart"/>
+      <w:r>
+        <w:rPr>
+          <w:b/>
+          <w:bCs/>
+          <w:lang w:val="en-US"/>
+        </w:rPr>
+        <w:t>torchao.quantization</w:t>
+      </w:r>
+      <w:proofErr w:type="spellEnd"/>
+      <w:r>
+        <w:rPr>
+          <w:b/>
+          <w:bCs/>
+          <w:lang w:val="en-US"/>
+        </w:rPr>
+        <w:t xml:space="preserve"> because </w:t>
+      </w:r>
+      <w:proofErr w:type="spellStart"/>
+      <w:r>
+        <w:rPr>
+          <w:b/>
+          <w:bCs/>
+          <w:lang w:val="en-US"/>
+        </w:rPr>
+        <w:t>torch.quantization</w:t>
+      </w:r>
+      <w:proofErr w:type="spellEnd"/>
+      <w:r>
+        <w:rPr>
+          <w:b/>
+          <w:bCs/>
+          <w:lang w:val="en-US"/>
+        </w:rPr>
+        <w:t xml:space="preserve"> has been deprecated. However the dynamic quantization in </w:t>
+      </w:r>
+      <w:proofErr w:type="spellStart"/>
+      <w:r>
+        <w:rPr>
+          <w:b/>
+          <w:bCs/>
+          <w:lang w:val="en-US"/>
+        </w:rPr>
+        <w:t>PyTorch</w:t>
+      </w:r>
+      <w:proofErr w:type="spellEnd"/>
+      <w:r>
+        <w:rPr>
+          <w:b/>
+          <w:bCs/>
+          <w:lang w:val="en-US"/>
+        </w:rPr>
+        <w:t xml:space="preserve"> doesn’t work for convolutional layers. For convolutional layers, the only thing that works is static quantization.</w:t>
       </w:r>
       <w:r>
         <w:rPr>
@@ -420,6 +538,7 @@
         </w:rPr>
         <w:t>/</w:t>
       </w:r>
+      <w:proofErr w:type="spellStart"/>
       <w:r>
         <w:rPr>
           <w:b/>
@@ -430,6 +549,7 @@
         </w:rPr>
         <w:t>ao</w:t>
       </w:r>
+      <w:proofErr w:type="spellEnd"/>
       <w:r>
         <w:rPr>
           <w:b/>
@@ -458,6 +578,7 @@
         </w:rPr>
         <w:t>/</w:t>
       </w:r>
+      <w:proofErr w:type="spellStart"/>
       <w:r>
         <w:rPr>
           <w:b/>
@@ -468,6 +589,7 @@
         </w:rPr>
         <w:t>api</w:t>
       </w:r>
+      <w:proofErr w:type="spellEnd"/>
       <w:r>
         <w:rPr>
           <w:b/>
@@ -592,6 +714,7 @@
           <w:lang w:val="en-US"/>
         </w:rPr>
       </w:pPr>
+      <w:proofErr w:type="spellStart"/>
       <w:r>
         <w:rPr>
           <w:b/>
@@ -599,7 +722,16 @@
           <w:lang w:val="en-US"/>
         </w:rPr>
         <w:lastRenderedPageBreak/>
-        <w:t>PyTorch Dynamic Quantization vs ONNX for Convolutional Layers</w:t>
+        <w:t>PyTorch</w:t>
+      </w:r>
+      <w:proofErr w:type="spellEnd"/>
+      <w:r>
+        <w:rPr>
+          <w:b/>
+          <w:bCs/>
+          <w:lang w:val="en-US"/>
+        </w:rPr>
+        <w:t xml:space="preserve"> Dynamic Quantization vs ONNX for Convolutional Layers</w:t>
       </w:r>
     </w:p>
     <w:p>
@@ -651,8 +783,21 @@
         </w:rPr>
         <w:t xml:space="preserve"> Quantized offline (pre-calculated INT8 values, scales, zero-points). </w:t>
       </w:r>
-      <w:r>
-        <w:t>Stored as INT8.</w:t>
+      <w:proofErr w:type="spellStart"/>
+      <w:r>
+        <w:t>Stored</w:t>
+      </w:r>
+      <w:proofErr w:type="spellEnd"/>
+      <w:r>
+        <w:t xml:space="preserve"> </w:t>
+      </w:r>
+      <w:proofErr w:type="spellStart"/>
+      <w:r>
+        <w:t>as</w:t>
+      </w:r>
+      <w:proofErr w:type="spellEnd"/>
+      <w:r>
+        <w:t xml:space="preserve"> INT8.</w:t>
       </w:r>
     </w:p>
     <w:p>
@@ -762,8 +907,14 @@
           <w:ilvl w:val="1"/>
           <w:numId w:val="1"/>
         </w:numPr>
-      </w:pPr>
-      <w:r>
+        <w:rPr>
+          <w:lang w:val="en-US"/>
+        </w:rPr>
+      </w:pPr>
+      <w:r>
+        <w:rPr>
+          <w:lang w:val="en-US"/>
+        </w:rPr>
         <w:t>Finally, it quantizes the activation tensor to INT8 using these parameters before performing the layer's computation (e.g., matrix multiplication, convolution) in INT8.</w:t>
       </w:r>
     </w:p>
@@ -773,18 +924,48 @@
           <w:ilvl w:val="1"/>
           <w:numId w:val="1"/>
         </w:numPr>
-      </w:pPr>
-      <w:r>
+        <w:rPr>
+          <w:lang w:val="en-US"/>
+        </w:rPr>
+      </w:pPr>
+      <w:r>
+        <w:rPr>
+          <w:lang w:val="en-US"/>
+        </w:rPr>
         <w:t>The output might be de-quantized back to FP32 or kept in INT8 if the next layer also supports it.</w:t>
       </w:r>
     </w:p>
     <w:p>
-      <w:r>
-        <w:rPr>
-          <w:b/>
-          <w:bCs/>
-        </w:rPr>
-        <w:t>Why Dynamic PTQ is Generally NOT Used/Supported for Conv Layers (Especially in PyTorch):</w:t>
+      <w:pPr>
+        <w:rPr>
+          <w:lang w:val="en-US"/>
+        </w:rPr>
+      </w:pPr>
+      <w:r>
+        <w:rPr>
+          <w:b/>
+          <w:bCs/>
+          <w:lang w:val="en-US"/>
+        </w:rPr>
+        <w:t xml:space="preserve">Why Dynamic PTQ is Generally NOT Used/Supported for Conv Layers (Especially in </w:t>
+      </w:r>
+      <w:proofErr w:type="spellStart"/>
+      <w:r>
+        <w:rPr>
+          <w:b/>
+          <w:bCs/>
+          <w:lang w:val="en-US"/>
+        </w:rPr>
+        <w:t>PyTorch</w:t>
+      </w:r>
+      <w:proofErr w:type="spellEnd"/>
+      <w:r>
+        <w:rPr>
+          <w:b/>
+          <w:bCs/>
+          <w:lang w:val="en-US"/>
+        </w:rPr>
+        <w:t>):</w:t>
       </w:r>
     </w:p>
     <w:p>
@@ -793,15 +974,22 @@
           <w:ilvl w:val="0"/>
           <w:numId w:val="2"/>
         </w:numPr>
-      </w:pPr>
-      <w:r>
-        <w:rPr>
-          <w:b/>
-          <w:bCs/>
+        <w:rPr>
+          <w:lang w:val="en-US"/>
+        </w:rPr>
+      </w:pPr>
+      <w:r>
+        <w:rPr>
+          <w:b/>
+          <w:bCs/>
+          <w:lang w:val="en-US"/>
         </w:rPr>
         <w:t>Massive Runtime Overhead:</w:t>
       </w:r>
       <w:r>
+        <w:rPr>
+          <w:lang w:val="en-US"/>
+        </w:rPr>
         <w:t> This is the primary reason. Convolutional layers are the computational backbone of CNNs like YOLO. They operate on large activation tensors (Height x Width x Channels).</w:t>
       </w:r>
     </w:p>
@@ -813,27 +1001,89 @@
         </w:numPr>
       </w:pPr>
       <w:r>
+        <w:rPr>
+          <w:lang w:val="en-US"/>
+        </w:rPr>
         <w:t>Calculating the min/max range of the </w:t>
       </w:r>
       <w:r>
         <w:rPr>
           <w:i/>
           <w:iCs/>
+          <w:lang w:val="en-US"/>
         </w:rPr>
         <w:t>entire</w:t>
       </w:r>
       <w:r>
+        <w:rPr>
+          <w:lang w:val="en-US"/>
+        </w:rPr>
         <w:t> activation tensor </w:t>
       </w:r>
       <w:r>
         <w:rPr>
           <w:i/>
           <w:iCs/>
+          <w:lang w:val="en-US"/>
         </w:rPr>
         <w:t>before every single convolution operation during runtime</w:t>
       </w:r>
       <w:r>
-        <w:t> is computationally expensive. It requires scanning potentially millions of values.</w:t>
+        <w:rPr>
+          <w:lang w:val="en-US"/>
+        </w:rPr>
+        <w:t xml:space="preserve"> is computationally expensive. </w:t>
+      </w:r>
+      <w:r>
+        <w:t xml:space="preserve">It </w:t>
+      </w:r>
+      <w:proofErr w:type="spellStart"/>
+      <w:r>
+        <w:t>requires</w:t>
+      </w:r>
+      <w:proofErr w:type="spellEnd"/>
+      <w:r>
+        <w:t xml:space="preserve"> </w:t>
+      </w:r>
+      <w:proofErr w:type="spellStart"/>
+      <w:r>
+        <w:t>scanning</w:t>
+      </w:r>
+      <w:proofErr w:type="spellEnd"/>
+      <w:r>
+        <w:t xml:space="preserve"> </w:t>
+      </w:r>
+      <w:proofErr w:type="spellStart"/>
+      <w:r>
+        <w:t>potentially</w:t>
+      </w:r>
+      <w:proofErr w:type="spellEnd"/>
+      <w:r>
+        <w:t xml:space="preserve"> </w:t>
+      </w:r>
+      <w:proofErr w:type="spellStart"/>
+      <w:r>
+        <w:t>millions</w:t>
+      </w:r>
+      <w:proofErr w:type="spellEnd"/>
+      <w:r>
+        <w:t xml:space="preserve"> </w:t>
+      </w:r>
+      <w:proofErr w:type="spellStart"/>
+      <w:r>
+        <w:t>of</w:t>
+      </w:r>
+      <w:proofErr w:type="spellEnd"/>
+      <w:r>
+        <w:t xml:space="preserve"> </w:t>
+      </w:r>
+      <w:proofErr w:type="spellStart"/>
+      <w:r>
+        <w:t>values</w:t>
+      </w:r>
+      <w:proofErr w:type="spellEnd"/>
+      <w:r>
+        <w:t>.</w:t>
       </w:r>
     </w:p>
     <w:p>
@@ -842,28 +1092,42 @@
           <w:ilvl w:val="1"/>
           <w:numId w:val="2"/>
         </w:numPr>
-      </w:pPr>
-      <w:r>
+        <w:rPr>
+          <w:lang w:val="en-US"/>
+        </w:rPr>
+      </w:pPr>
+      <w:r>
+        <w:rPr>
+          <w:lang w:val="en-US"/>
+        </w:rPr>
         <w:t>This range calculation overhead can easily negate, or even outweigh, the performance gains achieved by using faster INT8 arithmetic for the convolution itself. The goal of quantization is typically to </w:t>
       </w:r>
       <w:r>
         <w:rPr>
           <w:i/>
           <w:iCs/>
+          <w:lang w:val="en-US"/>
         </w:rPr>
         <w:t>speed up</w:t>
       </w:r>
       <w:r>
+        <w:rPr>
+          <w:lang w:val="en-US"/>
+        </w:rPr>
         <w:t> inference and reduce memory, but dynamic quantization on Conv layers often makes inference </w:t>
       </w:r>
       <w:r>
         <w:rPr>
           <w:i/>
           <w:iCs/>
+          <w:lang w:val="en-US"/>
         </w:rPr>
         <w:t>slower</w:t>
       </w:r>
       <w:r>
+        <w:rPr>
+          <w:lang w:val="en-US"/>
+        </w:rPr>
         <w:t>.</w:t>
       </w:r>
     </w:p>
@@ -873,35 +1137,50 @@
           <w:ilvl w:val="0"/>
           <w:numId w:val="2"/>
         </w:numPr>
-      </w:pPr>
-      <w:r>
-        <w:rPr>
-          <w:b/>
-          <w:bCs/>
+        <w:rPr>
+          <w:lang w:val="en-US"/>
+        </w:rPr>
+      </w:pPr>
+      <w:r>
+        <w:rPr>
+          <w:b/>
+          <w:bCs/>
+          <w:lang w:val="en-US"/>
         </w:rPr>
         <w:t>Activation Stability in CNNs:</w:t>
       </w:r>
       <w:r>
+        <w:rPr>
+          <w:lang w:val="en-US"/>
+        </w:rPr>
         <w:t> For many common image datasets and trained CNNs, the statistical distribution (and thus the min/max range) of activations within convolutional layers tends to be </w:t>
       </w:r>
       <w:r>
         <w:rPr>
           <w:i/>
           <w:iCs/>
+          <w:lang w:val="en-US"/>
         </w:rPr>
         <w:t>relatively stable</w:t>
       </w:r>
       <w:r>
+        <w:rPr>
+          <w:lang w:val="en-US"/>
+        </w:rPr>
         <w:t> across different input images </w:t>
       </w:r>
       <w:r>
         <w:rPr>
           <w:i/>
           <w:iCs/>
+          <w:lang w:val="en-US"/>
         </w:rPr>
         <w:t>from the same general domain</w:t>
       </w:r>
       <w:r>
+        <w:rPr>
+          <w:lang w:val="en-US"/>
+        </w:rPr>
         <w:t>.</w:t>
       </w:r>
     </w:p>
@@ -911,18 +1190,28 @@
           <w:ilvl w:val="1"/>
           <w:numId w:val="2"/>
         </w:numPr>
-      </w:pPr>
-      <w:r>
+        <w:rPr>
+          <w:lang w:val="en-US"/>
+        </w:rPr>
+      </w:pPr>
+      <w:r>
+        <w:rPr>
+          <w:lang w:val="en-US"/>
+        </w:rPr>
         <w:t>This stability means that determining a </w:t>
       </w:r>
       <w:r>
         <w:rPr>
           <w:i/>
           <w:iCs/>
+          <w:lang w:val="en-US"/>
         </w:rPr>
         <w:t>single</w:t>
       </w:r>
       <w:r>
+        <w:rPr>
+          <w:lang w:val="en-US"/>
+        </w:rPr>
         <w:t> representative range (scale/zero-point) for activations using a calibration dataset (i.e., static quantization) works quite well. The error introduced by using a fixed range is often small and acceptable.</w:t>
       </w:r>
     </w:p>
@@ -1086,7 +1375,35 @@
         <w:rPr>
           <w:lang w:val="en-US"/>
         </w:rPr>
-        <w:t> have operators (QuantizeLinear, DequantizeLinear) that can function dynamically if the scale and zero-point are provided as </w:t>
+        <w:t> have operators (</w:t>
+      </w:r>
+      <w:proofErr w:type="spellStart"/>
+      <w:r>
+        <w:rPr>
+          <w:lang w:val="en-US"/>
+        </w:rPr>
+        <w:t>QuantizeLinear</w:t>
+      </w:r>
+      <w:proofErr w:type="spellEnd"/>
+      <w:r>
+        <w:rPr>
+          <w:lang w:val="en-US"/>
+        </w:rPr>
+        <w:t>, </w:t>
+      </w:r>
+      <w:proofErr w:type="spellStart"/>
+      <w:r>
+        <w:rPr>
+          <w:lang w:val="en-US"/>
+        </w:rPr>
+        <w:t>DequantizeLinear</w:t>
+      </w:r>
+      <w:proofErr w:type="spellEnd"/>
+      <w:r>
+        <w:rPr>
+          <w:lang w:val="en-US"/>
+        </w:rPr>
+        <w:t>) that can function dynamically if the scale and zero-point are provided as </w:t>
       </w:r>
       <w:r>
         <w:rPr>
@@ -1100,7 +1417,35 @@
         <w:rPr>
           <w:lang w:val="en-US"/>
         </w:rPr>
-        <w:t> rather than compile-time constants. It also has reduction operators (ReduceMin, ReduceMax) needed to calculate ranges dynamically.</w:t>
+        <w:t> rather than compile-time constants. It also has reduction operators (</w:t>
+      </w:r>
+      <w:proofErr w:type="spellStart"/>
+      <w:r>
+        <w:rPr>
+          <w:lang w:val="en-US"/>
+        </w:rPr>
+        <w:t>ReduceMin</w:t>
+      </w:r>
+      <w:proofErr w:type="spellEnd"/>
+      <w:r>
+        <w:rPr>
+          <w:lang w:val="en-US"/>
+        </w:rPr>
+        <w:t>, </w:t>
+      </w:r>
+      <w:proofErr w:type="spellStart"/>
+      <w:r>
+        <w:rPr>
+          <w:lang w:val="en-US"/>
+        </w:rPr>
+        <w:t>ReduceMax</w:t>
+      </w:r>
+      <w:proofErr w:type="spellEnd"/>
+      <w:r>
+        <w:rPr>
+          <w:lang w:val="en-US"/>
+        </w:rPr>
+        <w:t>) needed to calculate ranges dynamically.</w:t>
       </w:r>
     </w:p>
     <w:p>
@@ -1125,7 +1470,49 @@
         <w:rPr>
           <w:lang w:val="en-US"/>
         </w:rPr>
-        <w:t> ONNX Runtime is designed to execute ONNX graphs. If a graph is constructed (either manually or by a conversion tool) to explicitly include the operations for calculating activation ranges (ReduceMin/ReduceMax), computing scales/zero-points, and then feeding those into QuantizeLinear before a Conv operator, ONNX Runtime </w:t>
+        <w:t> ONNX Runtime is designed to execute ONNX graphs. If a graph is constructed (either manually or by a conversion tool) to explicitly include the operations for calculating activation ranges (</w:t>
+      </w:r>
+      <w:proofErr w:type="spellStart"/>
+      <w:r>
+        <w:rPr>
+          <w:lang w:val="en-US"/>
+        </w:rPr>
+        <w:t>ReduceMin</w:t>
+      </w:r>
+      <w:proofErr w:type="spellEnd"/>
+      <w:r>
+        <w:rPr>
+          <w:lang w:val="en-US"/>
+        </w:rPr>
+        <w:t>/</w:t>
+      </w:r>
+      <w:proofErr w:type="spellStart"/>
+      <w:r>
+        <w:rPr>
+          <w:lang w:val="en-US"/>
+        </w:rPr>
+        <w:t>ReduceMax</w:t>
+      </w:r>
+      <w:proofErr w:type="spellEnd"/>
+      <w:r>
+        <w:rPr>
+          <w:lang w:val="en-US"/>
+        </w:rPr>
+        <w:t>), computing scales/zero-points, and then feeding those into </w:t>
+      </w:r>
+      <w:proofErr w:type="spellStart"/>
+      <w:r>
+        <w:rPr>
+          <w:lang w:val="en-US"/>
+        </w:rPr>
+        <w:t>QuantizeLinear</w:t>
+      </w:r>
+      <w:proofErr w:type="spellEnd"/>
+      <w:r>
+        <w:rPr>
+          <w:lang w:val="en-US"/>
+        </w:rPr>
+        <w:t> before a Conv operator, ONNX Runtime </w:t>
       </w:r>
       <w:r>
         <w:rPr>
@@ -1206,7 +1593,21 @@
         <w:rPr>
           <w:lang w:val="en-US"/>
         </w:rPr>
-        <w:t> way. Most tools converting models to ONNX for quantization (like torch.onnx.export with quantization settings, or dedicated quantization toolkits) will heavily favor generating a </w:t>
+        <w:t> way. Most tools converting models to ONNX for quantization (like </w:t>
+      </w:r>
+      <w:proofErr w:type="spellStart"/>
+      <w:r>
+        <w:rPr>
+          <w:lang w:val="en-US"/>
+        </w:rPr>
+        <w:t>torch.onnx.export</w:t>
+      </w:r>
+      <w:proofErr w:type="spellEnd"/>
+      <w:r>
+        <w:rPr>
+          <w:lang w:val="en-US"/>
+        </w:rPr>
+        <w:t> with quantization settings, or dedicated quantization toolkits) will heavily favor generating a </w:t>
       </w:r>
       <w:r>
         <w:rPr>
@@ -1268,7 +1669,23 @@
           <w:b/>
           <w:bCs/>
         </w:rPr>
-        <w:t>In Summary:</w:t>
+        <w:t xml:space="preserve">In </w:t>
+      </w:r>
+      <w:proofErr w:type="spellStart"/>
+      <w:r>
+        <w:rPr>
+          <w:b/>
+          <w:bCs/>
+        </w:rPr>
+        <w:t>Summary</w:t>
+      </w:r>
+      <w:proofErr w:type="spellEnd"/>
+      <w:r>
+        <w:rPr>
+          <w:b/>
+          <w:bCs/>
+        </w:rPr>
+        <w:t>:</w:t>
       </w:r>
     </w:p>
     <w:p>
@@ -1281,13 +1698,41 @@
           <w:lang w:val="en-US"/>
         </w:rPr>
       </w:pPr>
-      <w:r>
-        <w:rPr>
-          <w:b/>
-          <w:bCs/>
-          <w:lang w:val="en-US"/>
-        </w:rPr>
-        <w:t>PyTorch (torch.quantization)</w:t>
+      <w:proofErr w:type="spellStart"/>
+      <w:r>
+        <w:rPr>
+          <w:b/>
+          <w:bCs/>
+          <w:lang w:val="en-US"/>
+        </w:rPr>
+        <w:t>PyTorch</w:t>
+      </w:r>
+      <w:proofErr w:type="spellEnd"/>
+      <w:r>
+        <w:rPr>
+          <w:b/>
+          <w:bCs/>
+          <w:lang w:val="en-US"/>
+        </w:rPr>
+        <w:t xml:space="preserve"> (</w:t>
+      </w:r>
+      <w:proofErr w:type="spellStart"/>
+      <w:r>
+        <w:rPr>
+          <w:b/>
+          <w:bCs/>
+          <w:lang w:val="en-US"/>
+        </w:rPr>
+        <w:t>torch.quantization</w:t>
+      </w:r>
+      <w:proofErr w:type="spellEnd"/>
+      <w:r>
+        <w:rPr>
+          <w:b/>
+          <w:bCs/>
+          <w:lang w:val="en-US"/>
+        </w:rPr>
+        <w:t>)</w:t>
       </w:r>
       <w:r>
         <w:rPr>
@@ -1389,6 +1834,3242 @@
           <w:lang w:val="en-US"/>
         </w:rPr>
       </w:pPr>
+    </w:p>
+    <w:p>
+      <w:pPr>
+        <w:rPr>
+          <w:lang w:val="en-US"/>
+        </w:rPr>
+      </w:pPr>
+    </w:p>
+    <w:p>
+      <w:pPr>
+        <w:rPr>
+          <w:lang w:val="en-US"/>
+        </w:rPr>
+      </w:pPr>
+    </w:p>
+    <w:p>
+      <w:pPr>
+        <w:rPr>
+          <w:lang w:val="en-US"/>
+        </w:rPr>
+      </w:pPr>
+    </w:p>
+    <w:p>
+      <w:pPr>
+        <w:rPr>
+          <w:lang w:val="en-US"/>
+        </w:rPr>
+      </w:pPr>
+    </w:p>
+    <w:p>
+      <w:pPr>
+        <w:rPr>
+          <w:lang w:val="en-US"/>
+        </w:rPr>
+      </w:pPr>
+    </w:p>
+    <w:p>
+      <w:pPr>
+        <w:rPr>
+          <w:lang w:val="en-US"/>
+        </w:rPr>
+      </w:pPr>
+    </w:p>
+    <w:p>
+      <w:pPr>
+        <w:rPr>
+          <w:lang w:val="en-US"/>
+        </w:rPr>
+      </w:pPr>
+    </w:p>
+    <w:p>
+      <w:pPr>
+        <w:rPr>
+          <w:lang w:val="en-US"/>
+        </w:rPr>
+      </w:pPr>
+    </w:p>
+    <w:p>
+      <w:pPr>
+        <w:rPr>
+          <w:lang w:val="en-US"/>
+        </w:rPr>
+      </w:pPr>
+    </w:p>
+    <w:p>
+      <w:pPr>
+        <w:rPr>
+          <w:lang w:val="en-US"/>
+        </w:rPr>
+      </w:pPr>
+    </w:p>
+    <w:p>
+      <w:pPr>
+        <w:rPr>
+          <w:lang w:val="en-US"/>
+        </w:rPr>
+      </w:pPr>
+    </w:p>
+    <w:p>
+      <w:pPr>
+        <w:rPr>
+          <w:lang w:val="en-US"/>
+        </w:rPr>
+      </w:pPr>
+    </w:p>
+    <w:p>
+      <w:pPr>
+        <w:rPr>
+          <w:lang w:val="en-US"/>
+        </w:rPr>
+      </w:pPr>
+    </w:p>
+    <w:p>
+      <w:pPr>
+        <w:rPr>
+          <w:lang w:val="en-US"/>
+        </w:rPr>
+      </w:pPr>
+    </w:p>
+    <w:p>
+      <w:pPr>
+        <w:rPr>
+          <w:lang w:val="en-US"/>
+        </w:rPr>
+      </w:pPr>
+    </w:p>
+    <w:p>
+      <w:pPr>
+        <w:rPr>
+          <w:lang w:val="en-US"/>
+        </w:rPr>
+      </w:pPr>
+    </w:p>
+    <w:p>
+      <w:pPr>
+        <w:rPr>
+          <w:lang w:val="en-US"/>
+        </w:rPr>
+      </w:pPr>
+    </w:p>
+    <w:p>
+      <w:pPr>
+        <w:rPr>
+          <w:lang w:val="en-US"/>
+        </w:rPr>
+      </w:pPr>
+    </w:p>
+    <w:p>
+      <w:pPr>
+        <w:rPr>
+          <w:lang w:val="en-US"/>
+        </w:rPr>
+      </w:pPr>
+      <w:r>
+        <w:rPr>
+          <w:lang w:val="en-US"/>
+        </w:rPr>
+        <w:lastRenderedPageBreak/>
+        <w:t>Dynamic  Quantization vs Weight Quantization</w:t>
+      </w:r>
+    </w:p>
+    <w:tbl>
+      <w:tblPr>
+        <w:tblW w:w="0" w:type="auto"/>
+        <w:tblCellSpacing w:w="15" w:type="dxa"/>
+        <w:tblBorders>
+          <w:top w:val="single" w:sz="4" w:space="0" w:color="auto"/>
+          <w:left w:val="single" w:sz="4" w:space="0" w:color="auto"/>
+          <w:bottom w:val="single" w:sz="4" w:space="0" w:color="auto"/>
+          <w:right w:val="single" w:sz="4" w:space="0" w:color="auto"/>
+          <w:insideH w:val="single" w:sz="4" w:space="0" w:color="auto"/>
+          <w:insideV w:val="single" w:sz="4" w:space="0" w:color="auto"/>
+        </w:tblBorders>
+        <w:tblCellMar>
+          <w:top w:w="15" w:type="dxa"/>
+          <w:left w:w="15" w:type="dxa"/>
+          <w:bottom w:w="15" w:type="dxa"/>
+          <w:right w:w="15" w:type="dxa"/>
+        </w:tblCellMar>
+        <w:tblLook w:val="04A0" w:firstRow="1" w:lastRow="0" w:firstColumn="1" w:lastColumn="0" w:noHBand="0" w:noVBand="1"/>
+      </w:tblPr>
+      <w:tblGrid>
+        <w:gridCol w:w="2164"/>
+        <w:gridCol w:w="3497"/>
+        <w:gridCol w:w="3684"/>
+      </w:tblGrid>
+      <w:tr>
+        <w:trPr>
+          <w:tblHeader/>
+          <w:tblCellSpacing w:w="15" w:type="dxa"/>
+        </w:trPr>
+        <w:tc>
+          <w:tcPr>
+            <w:tcW w:w="0" w:type="auto"/>
+            <w:vAlign w:val="center"/>
+            <w:hideMark/>
+          </w:tcPr>
+          <w:p>
+            <w:pPr>
+              <w:rPr>
+                <w:b/>
+                <w:bCs/>
+              </w:rPr>
+            </w:pPr>
+            <w:proofErr w:type="spellStart"/>
+            <w:r>
+              <w:rPr>
+                <w:b/>
+                <w:bCs/>
+              </w:rPr>
+              <w:t>Aspect</w:t>
+            </w:r>
+            <w:proofErr w:type="spellEnd"/>
+          </w:p>
+        </w:tc>
+        <w:tc>
+          <w:tcPr>
+            <w:tcW w:w="0" w:type="auto"/>
+            <w:vAlign w:val="center"/>
+            <w:hideMark/>
+          </w:tcPr>
+          <w:p>
+            <w:pPr>
+              <w:rPr>
+                <w:b/>
+                <w:bCs/>
+              </w:rPr>
+            </w:pPr>
+            <w:r>
+              <w:rPr>
+                <w:b/>
+                <w:bCs/>
+              </w:rPr>
+              <w:t xml:space="preserve">Dynamic </w:t>
+            </w:r>
+            <w:proofErr w:type="spellStart"/>
+            <w:r>
+              <w:rPr>
+                <w:b/>
+                <w:bCs/>
+              </w:rPr>
+              <w:t>Quantization</w:t>
+            </w:r>
+            <w:proofErr w:type="spellEnd"/>
+          </w:p>
+        </w:tc>
+        <w:tc>
+          <w:tcPr>
+            <w:tcW w:w="0" w:type="auto"/>
+            <w:vAlign w:val="center"/>
+            <w:hideMark/>
+          </w:tcPr>
+          <w:p>
+            <w:pPr>
+              <w:rPr>
+                <w:b/>
+                <w:bCs/>
+              </w:rPr>
+            </w:pPr>
+            <w:proofErr w:type="spellStart"/>
+            <w:r>
+              <w:rPr>
+                <w:b/>
+                <w:bCs/>
+              </w:rPr>
+              <w:t>Weight</w:t>
+            </w:r>
+            <w:proofErr w:type="spellEnd"/>
+            <w:r>
+              <w:rPr>
+                <w:b/>
+                <w:bCs/>
+              </w:rPr>
+              <w:t xml:space="preserve">-Only </w:t>
+            </w:r>
+            <w:proofErr w:type="spellStart"/>
+            <w:r>
+              <w:rPr>
+                <w:b/>
+                <w:bCs/>
+              </w:rPr>
+              <w:t>Quantization</w:t>
+            </w:r>
+            <w:proofErr w:type="spellEnd"/>
+          </w:p>
+        </w:tc>
+      </w:tr>
+      <w:tr>
+        <w:trPr>
+          <w:tblCellSpacing w:w="15" w:type="dxa"/>
+        </w:trPr>
+        <w:tc>
+          <w:tcPr>
+            <w:tcW w:w="0" w:type="auto"/>
+            <w:vAlign w:val="center"/>
+            <w:hideMark/>
+          </w:tcPr>
+          <w:p>
+            <w:proofErr w:type="spellStart"/>
+            <w:r>
+              <w:rPr>
+                <w:b/>
+                <w:bCs/>
+              </w:rPr>
+              <w:t>Weights</w:t>
+            </w:r>
+            <w:proofErr w:type="spellEnd"/>
+          </w:p>
+        </w:tc>
+        <w:tc>
+          <w:tcPr>
+            <w:tcW w:w="0" w:type="auto"/>
+            <w:vAlign w:val="center"/>
+            <w:hideMark/>
+          </w:tcPr>
+          <w:p>
+            <w:proofErr w:type="spellStart"/>
+            <w:r>
+              <w:t>Quantized</w:t>
+            </w:r>
+            <w:proofErr w:type="spellEnd"/>
+            <w:r>
+              <w:t xml:space="preserve"> </w:t>
+            </w:r>
+            <w:proofErr w:type="spellStart"/>
+            <w:r>
+              <w:t>to</w:t>
+            </w:r>
+            <w:proofErr w:type="spellEnd"/>
+            <w:r>
+              <w:t xml:space="preserve"> 8-bit </w:t>
+            </w:r>
+            <w:proofErr w:type="spellStart"/>
+            <w:r>
+              <w:t>integers</w:t>
+            </w:r>
+            <w:proofErr w:type="spellEnd"/>
+          </w:p>
+        </w:tc>
+        <w:tc>
+          <w:tcPr>
+            <w:tcW w:w="0" w:type="auto"/>
+            <w:vAlign w:val="center"/>
+            <w:hideMark/>
+          </w:tcPr>
+          <w:p>
+            <w:pPr>
+              <w:rPr>
+                <w:lang w:val="en-US"/>
+              </w:rPr>
+            </w:pPr>
+            <w:r>
+              <w:rPr>
+                <w:lang w:val="en-US"/>
+              </w:rPr>
+              <w:t>Quantized to 8-bit or 4-bit integers</w:t>
+            </w:r>
+          </w:p>
+        </w:tc>
+      </w:tr>
+      <w:tr>
+        <w:trPr>
+          <w:tblCellSpacing w:w="15" w:type="dxa"/>
+        </w:trPr>
+        <w:tc>
+          <w:tcPr>
+            <w:tcW w:w="0" w:type="auto"/>
+            <w:vAlign w:val="center"/>
+            <w:hideMark/>
+          </w:tcPr>
+          <w:p>
+            <w:proofErr w:type="spellStart"/>
+            <w:r>
+              <w:rPr>
+                <w:b/>
+                <w:bCs/>
+              </w:rPr>
+              <w:t>Activations</w:t>
+            </w:r>
+            <w:proofErr w:type="spellEnd"/>
+          </w:p>
+        </w:tc>
+        <w:tc>
+          <w:tcPr>
+            <w:tcW w:w="0" w:type="auto"/>
+            <w:vAlign w:val="center"/>
+            <w:hideMark/>
+          </w:tcPr>
+          <w:p>
+            <w:proofErr w:type="spellStart"/>
+            <w:r>
+              <w:t>Quantized</w:t>
+            </w:r>
+            <w:proofErr w:type="spellEnd"/>
+            <w:r>
+              <w:t xml:space="preserve"> </w:t>
+            </w:r>
+            <w:proofErr w:type="spellStart"/>
+            <w:r>
+              <w:t>dynamically</w:t>
+            </w:r>
+            <w:proofErr w:type="spellEnd"/>
+            <w:r>
+              <w:t xml:space="preserve"> </w:t>
+            </w:r>
+            <w:proofErr w:type="spellStart"/>
+            <w:r>
+              <w:t>during</w:t>
+            </w:r>
+            <w:proofErr w:type="spellEnd"/>
+            <w:r>
+              <w:t xml:space="preserve"> </w:t>
+            </w:r>
+            <w:proofErr w:type="spellStart"/>
+            <w:r>
+              <w:t>inference</w:t>
+            </w:r>
+            <w:proofErr w:type="spellEnd"/>
+          </w:p>
+        </w:tc>
+        <w:tc>
+          <w:tcPr>
+            <w:tcW w:w="0" w:type="auto"/>
+            <w:vAlign w:val="center"/>
+            <w:hideMark/>
+          </w:tcPr>
+          <w:p>
+            <w:pPr>
+              <w:rPr>
+                <w:lang w:val="en-US"/>
+              </w:rPr>
+            </w:pPr>
+            <w:r>
+              <w:rPr>
+                <w:lang w:val="en-US"/>
+              </w:rPr>
+              <w:t>Remain in original precision (e.g., FP32)</w:t>
+            </w:r>
+          </w:p>
+        </w:tc>
+      </w:tr>
+      <w:tr>
+        <w:trPr>
+          <w:tblCellSpacing w:w="15" w:type="dxa"/>
+        </w:trPr>
+        <w:tc>
+          <w:tcPr>
+            <w:tcW w:w="0" w:type="auto"/>
+            <w:vAlign w:val="center"/>
+            <w:hideMark/>
+          </w:tcPr>
+          <w:p>
+            <w:proofErr w:type="spellStart"/>
+            <w:r>
+              <w:rPr>
+                <w:b/>
+                <w:bCs/>
+              </w:rPr>
+              <w:t>Calibration</w:t>
+            </w:r>
+            <w:proofErr w:type="spellEnd"/>
+            <w:r>
+              <w:rPr>
+                <w:b/>
+                <w:bCs/>
+              </w:rPr>
+              <w:t xml:space="preserve"> </w:t>
+            </w:r>
+            <w:proofErr w:type="spellStart"/>
+            <w:r>
+              <w:rPr>
+                <w:b/>
+                <w:bCs/>
+              </w:rPr>
+              <w:t>Needed</w:t>
+            </w:r>
+            <w:proofErr w:type="spellEnd"/>
+          </w:p>
+        </w:tc>
+        <w:tc>
+          <w:tcPr>
+            <w:tcW w:w="0" w:type="auto"/>
+            <w:vAlign w:val="center"/>
+            <w:hideMark/>
+          </w:tcPr>
+          <w:p>
+            <w:r>
+              <w:t>No</w:t>
+            </w:r>
+          </w:p>
+        </w:tc>
+        <w:tc>
+          <w:tcPr>
+            <w:tcW w:w="0" w:type="auto"/>
+            <w:vAlign w:val="center"/>
+            <w:hideMark/>
+          </w:tcPr>
+          <w:p>
+            <w:r>
+              <w:t>No</w:t>
+            </w:r>
+          </w:p>
+        </w:tc>
+      </w:tr>
+      <w:tr>
+        <w:trPr>
+          <w:tblCellSpacing w:w="15" w:type="dxa"/>
+        </w:trPr>
+        <w:tc>
+          <w:tcPr>
+            <w:tcW w:w="0" w:type="auto"/>
+            <w:vAlign w:val="center"/>
+            <w:hideMark/>
+          </w:tcPr>
+          <w:p>
+            <w:r>
+              <w:rPr>
+                <w:b/>
+                <w:bCs/>
+              </w:rPr>
+              <w:t xml:space="preserve">Model </w:t>
+            </w:r>
+            <w:proofErr w:type="spellStart"/>
+            <w:r>
+              <w:rPr>
+                <w:b/>
+                <w:bCs/>
+              </w:rPr>
+              <w:t>Size</w:t>
+            </w:r>
+            <w:proofErr w:type="spellEnd"/>
+            <w:r>
+              <w:rPr>
+                <w:b/>
+                <w:bCs/>
+              </w:rPr>
+              <w:t xml:space="preserve"> </w:t>
+            </w:r>
+            <w:proofErr w:type="spellStart"/>
+            <w:r>
+              <w:rPr>
+                <w:b/>
+                <w:bCs/>
+              </w:rPr>
+              <w:t>Reduction</w:t>
+            </w:r>
+            <w:proofErr w:type="spellEnd"/>
+          </w:p>
+        </w:tc>
+        <w:tc>
+          <w:tcPr>
+            <w:tcW w:w="0" w:type="auto"/>
+            <w:vAlign w:val="center"/>
+            <w:hideMark/>
+          </w:tcPr>
+          <w:p>
+            <w:proofErr w:type="spellStart"/>
+            <w:r>
+              <w:t>Moderate</w:t>
+            </w:r>
+            <w:proofErr w:type="spellEnd"/>
+          </w:p>
+        </w:tc>
+        <w:tc>
+          <w:tcPr>
+            <w:tcW w:w="0" w:type="auto"/>
+            <w:vAlign w:val="center"/>
+            <w:hideMark/>
+          </w:tcPr>
+          <w:p>
+            <w:proofErr w:type="spellStart"/>
+            <w:r>
+              <w:t>Significant</w:t>
+            </w:r>
+            <w:proofErr w:type="spellEnd"/>
+          </w:p>
+        </w:tc>
+      </w:tr>
+      <w:tr>
+        <w:trPr>
+          <w:tblCellSpacing w:w="15" w:type="dxa"/>
+        </w:trPr>
+        <w:tc>
+          <w:tcPr>
+            <w:tcW w:w="0" w:type="auto"/>
+            <w:vAlign w:val="center"/>
+            <w:hideMark/>
+          </w:tcPr>
+          <w:p>
+            <w:proofErr w:type="spellStart"/>
+            <w:r>
+              <w:rPr>
+                <w:b/>
+                <w:bCs/>
+              </w:rPr>
+              <w:t>Inference</w:t>
+            </w:r>
+            <w:proofErr w:type="spellEnd"/>
+            <w:r>
+              <w:rPr>
+                <w:b/>
+                <w:bCs/>
+              </w:rPr>
+              <w:t xml:space="preserve"> </w:t>
+            </w:r>
+            <w:proofErr w:type="spellStart"/>
+            <w:r>
+              <w:rPr>
+                <w:b/>
+                <w:bCs/>
+              </w:rPr>
+              <w:t>Speedup</w:t>
+            </w:r>
+            <w:proofErr w:type="spellEnd"/>
+          </w:p>
+        </w:tc>
+        <w:tc>
+          <w:tcPr>
+            <w:tcW w:w="0" w:type="auto"/>
+            <w:vAlign w:val="center"/>
+            <w:hideMark/>
+          </w:tcPr>
+          <w:p>
+            <w:proofErr w:type="spellStart"/>
+            <w:r>
+              <w:t>Moderate</w:t>
+            </w:r>
+            <w:proofErr w:type="spellEnd"/>
+          </w:p>
+        </w:tc>
+        <w:tc>
+          <w:tcPr>
+            <w:tcW w:w="0" w:type="auto"/>
+            <w:vAlign w:val="center"/>
+            <w:hideMark/>
+          </w:tcPr>
+          <w:p>
+            <w:r>
+              <w:t>High</w:t>
+            </w:r>
+          </w:p>
+        </w:tc>
+      </w:tr>
+      <w:tr>
+        <w:trPr>
+          <w:tblCellSpacing w:w="15" w:type="dxa"/>
+        </w:trPr>
+        <w:tc>
+          <w:tcPr>
+            <w:tcW w:w="0" w:type="auto"/>
+            <w:vAlign w:val="center"/>
+            <w:hideMark/>
+          </w:tcPr>
+          <w:p>
+            <w:proofErr w:type="spellStart"/>
+            <w:r>
+              <w:rPr>
+                <w:b/>
+                <w:bCs/>
+              </w:rPr>
+              <w:t>Use</w:t>
+            </w:r>
+            <w:proofErr w:type="spellEnd"/>
+            <w:r>
+              <w:rPr>
+                <w:b/>
+                <w:bCs/>
+              </w:rPr>
+              <w:t xml:space="preserve"> </w:t>
+            </w:r>
+            <w:proofErr w:type="spellStart"/>
+            <w:r>
+              <w:rPr>
+                <w:b/>
+                <w:bCs/>
+              </w:rPr>
+              <w:t>Cases</w:t>
+            </w:r>
+            <w:proofErr w:type="spellEnd"/>
+          </w:p>
+        </w:tc>
+        <w:tc>
+          <w:tcPr>
+            <w:tcW w:w="0" w:type="auto"/>
+            <w:vAlign w:val="center"/>
+            <w:hideMark/>
+          </w:tcPr>
+          <w:p>
+            <w:r>
+              <w:t>General-</w:t>
+            </w:r>
+            <w:proofErr w:type="spellStart"/>
+            <w:r>
+              <w:t>purpose</w:t>
+            </w:r>
+            <w:proofErr w:type="spellEnd"/>
+            <w:r>
+              <w:t xml:space="preserve"> </w:t>
+            </w:r>
+            <w:proofErr w:type="spellStart"/>
+            <w:r>
+              <w:t>models</w:t>
+            </w:r>
+            <w:proofErr w:type="spellEnd"/>
+            <w:r>
+              <w:t xml:space="preserve">, </w:t>
+            </w:r>
+            <w:proofErr w:type="spellStart"/>
+            <w:r>
+              <w:t>transformers</w:t>
+            </w:r>
+            <w:proofErr w:type="spellEnd"/>
+          </w:p>
+        </w:tc>
+        <w:tc>
+          <w:tcPr>
+            <w:tcW w:w="0" w:type="auto"/>
+            <w:vAlign w:val="center"/>
+            <w:hideMark/>
+          </w:tcPr>
+          <w:p>
+            <w:r>
+              <w:t xml:space="preserve">LLMs, </w:t>
+            </w:r>
+            <w:proofErr w:type="spellStart"/>
+            <w:r>
+              <w:t>memory-constrained</w:t>
+            </w:r>
+            <w:proofErr w:type="spellEnd"/>
+            <w:r>
+              <w:t xml:space="preserve"> </w:t>
+            </w:r>
+            <w:proofErr w:type="spellStart"/>
+            <w:r>
+              <w:t>environments</w:t>
+            </w:r>
+            <w:proofErr w:type="spellEnd"/>
+          </w:p>
+        </w:tc>
+      </w:tr>
+    </w:tbl>
+    <w:p>
+      <w:pPr>
+        <w:rPr>
+          <w:lang w:val="en-US"/>
+        </w:rPr>
+      </w:pPr>
+    </w:p>
+    <w:p>
+      <w:pPr>
+        <w:rPr>
+          <w:lang w:val="en-US"/>
+        </w:rPr>
+      </w:pPr>
+    </w:p>
+    <w:p>
+      <w:pPr>
+        <w:jc w:val="center"/>
+        <w:rPr>
+          <w:b/>
+          <w:bCs/>
+          <w:sz w:val="28"/>
+          <w:szCs w:val="28"/>
+          <w:lang w:val="en-US"/>
+        </w:rPr>
+      </w:pPr>
+      <w:r>
+        <w:rPr>
+          <w:b/>
+          <w:bCs/>
+          <w:sz w:val="28"/>
+          <w:szCs w:val="28"/>
+          <w:lang w:val="en-US"/>
+        </w:rPr>
+        <w:t>Applying ONNX pre-processing before applying quantization</w:t>
+      </w:r>
+    </w:p>
+    <w:p>
+      <w:pPr>
+        <w:numPr>
+          <w:ilvl w:val="0"/>
+          <w:numId w:val="5"/>
+        </w:numPr>
+      </w:pPr>
+      <w:proofErr w:type="spellStart"/>
+      <w:r>
+        <w:rPr>
+          <w:b/>
+          <w:bCs/>
+        </w:rPr>
+        <w:t>Improved</w:t>
+      </w:r>
+      <w:proofErr w:type="spellEnd"/>
+      <w:r>
+        <w:rPr>
+          <w:b/>
+          <w:bCs/>
+        </w:rPr>
+        <w:t xml:space="preserve"> </w:t>
+      </w:r>
+      <w:proofErr w:type="spellStart"/>
+      <w:r>
+        <w:rPr>
+          <w:b/>
+          <w:bCs/>
+        </w:rPr>
+        <w:t>Quantization</w:t>
+      </w:r>
+      <w:proofErr w:type="spellEnd"/>
+      <w:r>
+        <w:rPr>
+          <w:b/>
+          <w:bCs/>
+        </w:rPr>
+        <w:t xml:space="preserve"> Quality &amp; </w:t>
+      </w:r>
+      <w:proofErr w:type="spellStart"/>
+      <w:r>
+        <w:rPr>
+          <w:b/>
+          <w:bCs/>
+        </w:rPr>
+        <w:t>Stability</w:t>
+      </w:r>
+      <w:proofErr w:type="spellEnd"/>
+      <w:r>
+        <w:rPr>
+          <w:b/>
+          <w:bCs/>
+        </w:rPr>
+        <w:t>:</w:t>
+      </w:r>
+    </w:p>
+    <w:p>
+      <w:pPr>
+        <w:numPr>
+          <w:ilvl w:val="1"/>
+          <w:numId w:val="5"/>
+        </w:numPr>
+        <w:rPr>
+          <w:lang w:val="en-US"/>
+        </w:rPr>
+      </w:pPr>
+      <w:r>
+        <w:rPr>
+          <w:b/>
+          <w:bCs/>
+          <w:lang w:val="en-US"/>
+        </w:rPr>
+        <w:t>Shape Inference:</w:t>
+      </w:r>
+      <w:r>
+        <w:rPr>
+          <w:lang w:val="en-US"/>
+        </w:rPr>
+        <w:t> Knowing tensor shapes allows the quantization tools (</w:t>
+      </w:r>
+      <w:proofErr w:type="spellStart"/>
+      <w:r>
+        <w:rPr>
+          <w:lang w:val="en-US"/>
+        </w:rPr>
+        <w:t>onnxruntime.quantization</w:t>
+      </w:r>
+      <w:proofErr w:type="spellEnd"/>
+      <w:r>
+        <w:rPr>
+          <w:lang w:val="en-US"/>
+        </w:rPr>
+        <w:t>) to work more effectively and reliably. It helps understand the graph structure and prevents potential errors or suboptimal decisions during the quantization process. For YOLOv8 (a CNN), the standard ONNX shape inference is appropriate.</w:t>
+      </w:r>
+    </w:p>
+    <w:p>
+      <w:pPr>
+        <w:numPr>
+          <w:ilvl w:val="1"/>
+          <w:numId w:val="5"/>
+        </w:numPr>
+        <w:rPr>
+          <w:lang w:val="en-US"/>
+        </w:rPr>
+      </w:pPr>
+      <w:r>
+        <w:rPr>
+          <w:b/>
+          <w:bCs/>
+          <w:lang w:val="en-US"/>
+        </w:rPr>
+        <w:t>Operator Fusion (Model Optimization):</w:t>
+      </w:r>
+      <w:r>
+        <w:rPr>
+          <w:lang w:val="en-US"/>
+        </w:rPr>
+        <w:t> This is particularly relevant for models like YOLOv8 which heavily rely on patterns like Convolution followed by Batch Normalization.</w:t>
+      </w:r>
+    </w:p>
+    <w:p>
+      <w:pPr>
+        <w:numPr>
+          <w:ilvl w:val="2"/>
+          <w:numId w:val="5"/>
+        </w:numPr>
+        <w:rPr>
+          <w:lang w:val="en-US"/>
+        </w:rPr>
+      </w:pPr>
+      <w:r>
+        <w:rPr>
+          <w:b/>
+          <w:bCs/>
+          <w:lang w:val="en-US"/>
+        </w:rPr>
+        <w:t>Efficiency:</w:t>
+      </w:r>
+      <w:r>
+        <w:rPr>
+          <w:lang w:val="en-US"/>
+        </w:rPr>
+        <w:t> Fusing these operations creates a more computationally efficient graph. This means your FP32 baseline (if you evaluate the </w:t>
+      </w:r>
+      <w:r>
+        <w:rPr>
+          <w:i/>
+          <w:iCs/>
+          <w:lang w:val="en-US"/>
+        </w:rPr>
+        <w:t>processed</w:t>
+      </w:r>
+      <w:r>
+        <w:rPr>
+          <w:lang w:val="en-US"/>
+        </w:rPr>
+        <w:t> model) will be faster, and the potential speedup from INT8 quantization will be applied to this already optimized graph, giving a more realistic performance comparison.</w:t>
+      </w:r>
+    </w:p>
+    <w:p>
+      <w:pPr>
+        <w:numPr>
+          <w:ilvl w:val="2"/>
+          <w:numId w:val="5"/>
+        </w:numPr>
+        <w:rPr>
+          <w:lang w:val="en-US"/>
+        </w:rPr>
+      </w:pPr>
+      <w:r>
+        <w:rPr>
+          <w:b/>
+          <w:bCs/>
+          <w:lang w:val="en-US"/>
+        </w:rPr>
+        <w:t>Quantization Accuracy:</w:t>
+      </w:r>
+      <w:r>
+        <w:rPr>
+          <w:lang w:val="en-US"/>
+        </w:rPr>
+        <w:t xml:space="preserve"> Quantizing a fused operation (like </w:t>
+      </w:r>
+      <w:proofErr w:type="spellStart"/>
+      <w:r>
+        <w:rPr>
+          <w:lang w:val="en-US"/>
+        </w:rPr>
+        <w:t>ConvBN</w:t>
+      </w:r>
+      <w:proofErr w:type="spellEnd"/>
+      <w:r>
+        <w:rPr>
+          <w:lang w:val="en-US"/>
+        </w:rPr>
+        <w:t>) is often handled more effectively by quantization tools and hardware backends than quantizing the two operations separately. This can lead to slightly better accuracy in the final quantized model.</w:t>
+      </w:r>
+    </w:p>
+    <w:p>
+      <w:pPr>
+        <w:numPr>
+          <w:ilvl w:val="0"/>
+          <w:numId w:val="5"/>
+        </w:numPr>
+        <w:rPr>
+          <w:lang w:val="en-US"/>
+        </w:rPr>
+      </w:pPr>
+      <w:r>
+        <w:rPr>
+          <w:b/>
+          <w:bCs/>
+          <w:lang w:val="en-US"/>
+        </w:rPr>
+        <w:lastRenderedPageBreak/>
+        <w:t>Alignment with Best Practices &amp; Debugging:</w:t>
+      </w:r>
+    </w:p>
+    <w:p>
+      <w:pPr>
+        <w:numPr>
+          <w:ilvl w:val="1"/>
+          <w:numId w:val="5"/>
+        </w:numPr>
+        <w:rPr>
+          <w:lang w:val="en-US"/>
+        </w:rPr>
+      </w:pPr>
+      <w:r>
+        <w:rPr>
+          <w:lang w:val="en-US"/>
+        </w:rPr>
+        <w:t>The documentation explicitly recommends performing optimization during pre-processing </w:t>
+      </w:r>
+      <w:r>
+        <w:rPr>
+          <w:i/>
+          <w:iCs/>
+          <w:lang w:val="en-US"/>
+        </w:rPr>
+        <w:t>before</w:t>
+      </w:r>
+      <w:r>
+        <w:rPr>
+          <w:lang w:val="en-US"/>
+        </w:rPr>
+        <w:t> quantization. This separates the effects of graph optimization from the effects of quantization itself.</w:t>
+      </w:r>
+    </w:p>
+    <w:p>
+      <w:pPr>
+        <w:numPr>
+          <w:ilvl w:val="1"/>
+          <w:numId w:val="5"/>
+        </w:numPr>
+        <w:rPr>
+          <w:lang w:val="en-US"/>
+        </w:rPr>
+      </w:pPr>
+      <w:r>
+        <w:rPr>
+          <w:lang w:val="en-US"/>
+        </w:rPr>
+        <w:t>If you encounter accuracy issues later, you'll know they are more likely due to the quantization step itself (either the standard process or your novel calibration) rather than being confounded by simultaneous graph transformations.</w:t>
+      </w:r>
+    </w:p>
+    <w:p>
+      <w:pPr>
+        <w:numPr>
+          <w:ilvl w:val="0"/>
+          <w:numId w:val="5"/>
+        </w:numPr>
+      </w:pPr>
+      <w:proofErr w:type="spellStart"/>
+      <w:r>
+        <w:rPr>
+          <w:b/>
+          <w:bCs/>
+        </w:rPr>
+        <w:t>Consistency</w:t>
+      </w:r>
+      <w:proofErr w:type="spellEnd"/>
+      <w:r>
+        <w:rPr>
+          <w:b/>
+          <w:bCs/>
+        </w:rPr>
+        <w:t>:</w:t>
+      </w:r>
+    </w:p>
+    <w:p>
+      <w:pPr>
+        <w:numPr>
+          <w:ilvl w:val="1"/>
+          <w:numId w:val="5"/>
+        </w:numPr>
+        <w:rPr>
+          <w:lang w:val="en-US"/>
+        </w:rPr>
+      </w:pPr>
+      <w:r>
+        <w:rPr>
+          <w:lang w:val="en-US"/>
+        </w:rPr>
+        <w:t>Applying pre-processing once creates a stable, optimized FP32 ONNX graph (</w:t>
+      </w:r>
+      <w:proofErr w:type="spellStart"/>
+      <w:r>
+        <w:rPr>
+          <w:lang w:val="en-US"/>
+        </w:rPr>
+        <w:t>model_processed.onnx</w:t>
+      </w:r>
+      <w:proofErr w:type="spellEnd"/>
+      <w:r>
+        <w:rPr>
+          <w:lang w:val="en-US"/>
+        </w:rPr>
+        <w:t>). You should then use </w:t>
+      </w:r>
+      <w:r>
+        <w:rPr>
+          <w:i/>
+          <w:iCs/>
+          <w:lang w:val="en-US"/>
+        </w:rPr>
+        <w:t>this</w:t>
+      </w:r>
+      <w:r>
+        <w:rPr>
+          <w:lang w:val="en-US"/>
+        </w:rPr>
+        <w:t> processed model as the </w:t>
+      </w:r>
+      <w:r>
+        <w:rPr>
+          <w:b/>
+          <w:bCs/>
+          <w:lang w:val="en-US"/>
+        </w:rPr>
+        <w:t>input</w:t>
+      </w:r>
+      <w:r>
+        <w:rPr>
+          <w:lang w:val="en-US"/>
+        </w:rPr>
+        <w:t> for all your subsequent steps:</w:t>
+      </w:r>
+    </w:p>
+    <w:p>
+      <w:pPr>
+        <w:numPr>
+          <w:ilvl w:val="2"/>
+          <w:numId w:val="5"/>
+        </w:numPr>
+        <w:rPr>
+          <w:lang w:val="en-US"/>
+        </w:rPr>
+      </w:pPr>
+      <w:r>
+        <w:rPr>
+          <w:lang w:val="en-US"/>
+        </w:rPr>
+        <w:t>Evaluating the FP32 baseline performance.</w:t>
+      </w:r>
+      <w:r>
+        <w:rPr>
+          <w:lang w:val="en-US"/>
+        </w:rPr>
+        <w:t xml:space="preserve"> (also apply ONNX pre-processing before evaluating the full precision FP32 model)</w:t>
+      </w:r>
+    </w:p>
+    <w:p>
+      <w:pPr>
+        <w:numPr>
+          <w:ilvl w:val="2"/>
+          <w:numId w:val="5"/>
+        </w:numPr>
+        <w:rPr>
+          <w:lang w:val="en-US"/>
+        </w:rPr>
+      </w:pPr>
+      <w:r>
+        <w:rPr>
+          <w:lang w:val="en-US"/>
+        </w:rPr>
+        <w:t>Evaluating the FP16 model.</w:t>
+      </w:r>
+    </w:p>
+    <w:p>
+      <w:pPr>
+        <w:numPr>
+          <w:ilvl w:val="2"/>
+          <w:numId w:val="5"/>
+        </w:numPr>
+      </w:pPr>
+      <w:proofErr w:type="spellStart"/>
+      <w:r>
+        <w:t>Applying</w:t>
+      </w:r>
+      <w:proofErr w:type="spellEnd"/>
+      <w:r>
+        <w:t xml:space="preserve"> </w:t>
+      </w:r>
+      <w:proofErr w:type="spellStart"/>
+      <w:r>
+        <w:t>standard</w:t>
+      </w:r>
+      <w:proofErr w:type="spellEnd"/>
+      <w:r>
+        <w:t xml:space="preserve"> </w:t>
+      </w:r>
+      <w:proofErr w:type="spellStart"/>
+      <w:r>
+        <w:t>Static</w:t>
+      </w:r>
+      <w:proofErr w:type="spellEnd"/>
+      <w:r>
+        <w:t xml:space="preserve"> PTQ.</w:t>
+      </w:r>
+    </w:p>
+    <w:p>
+      <w:pPr>
+        <w:numPr>
+          <w:ilvl w:val="2"/>
+          <w:numId w:val="5"/>
+        </w:numPr>
+      </w:pPr>
+      <w:proofErr w:type="spellStart"/>
+      <w:r>
+        <w:t>Applying</w:t>
+      </w:r>
+      <w:proofErr w:type="spellEnd"/>
+      <w:r>
+        <w:t xml:space="preserve"> Dynamic PTQ.</w:t>
+      </w:r>
+    </w:p>
+    <w:p>
+      <w:pPr>
+        <w:numPr>
+          <w:ilvl w:val="2"/>
+          <w:numId w:val="5"/>
+        </w:numPr>
+        <w:rPr>
+          <w:lang w:val="en-US"/>
+        </w:rPr>
+      </w:pPr>
+      <w:r>
+        <w:rPr>
+          <w:lang w:val="en-US"/>
+        </w:rPr>
+        <w:t>Applying your novel Degradation-Aware Static PTQ.</w:t>
+      </w:r>
+    </w:p>
+    <w:p>
+      <w:pPr>
+        <w:numPr>
+          <w:ilvl w:val="1"/>
+          <w:numId w:val="5"/>
+        </w:numPr>
+        <w:rPr>
+          <w:lang w:val="en-US"/>
+        </w:rPr>
+      </w:pPr>
+      <w:r>
+        <w:rPr>
+          <w:lang w:val="en-US"/>
+        </w:rPr>
+        <w:t>This ensures that all quantization methods are applied to the exact same underlying graph structure, making the comparisons fair and focused solely on the impact of the quantization technique and calibration data.</w:t>
+      </w:r>
+    </w:p>
+    <w:p>
+      <w:pPr>
+        <w:rPr>
+          <w:lang w:val="en-US"/>
+        </w:rPr>
+      </w:pPr>
+      <w:r>
+        <w:rPr>
+          <w:b/>
+          <w:bCs/>
+          <w:lang w:val="en-US"/>
+        </w:rPr>
+        <w:t>Potential Caveat (Not applicable to YOLOv8n):</w:t>
+      </w:r>
+    </w:p>
+    <w:p>
+      <w:pPr>
+        <w:numPr>
+          <w:ilvl w:val="0"/>
+          <w:numId w:val="6"/>
+        </w:numPr>
+        <w:rPr>
+          <w:lang w:val="en-US"/>
+        </w:rPr>
+      </w:pPr>
+      <w:r>
+        <w:rPr>
+          <w:lang w:val="en-US"/>
+        </w:rPr>
+        <w:t>The documentation mentions a 2GB model size limit for optimization. YOLOv8n is much smaller than this, so it's not a concern for your specific model, but good to be aware of for larger models.</w:t>
+      </w:r>
+    </w:p>
+    <w:p>
+      <w:pPr>
+        <w:rPr>
+          <w:lang w:val="en-US"/>
+        </w:rPr>
+      </w:pPr>
+      <w:r>
+        <w:rPr>
+          <w:b/>
+          <w:bCs/>
+          <w:lang w:val="en-US"/>
+        </w:rPr>
+        <w:t>I</w:t>
+      </w:r>
+      <w:r>
+        <w:rPr>
+          <w:b/>
+          <w:bCs/>
+          <w:lang w:val="en-US"/>
+        </w:rPr>
+        <w:t>n</w:t>
+      </w:r>
+      <w:r>
+        <w:rPr>
+          <w:b/>
+          <w:bCs/>
+          <w:lang w:val="en-US"/>
+        </w:rPr>
+        <w:t xml:space="preserve"> </w:t>
+      </w:r>
+      <w:r>
+        <w:rPr>
+          <w:b/>
+          <w:bCs/>
+          <w:lang w:val="en-US"/>
+        </w:rPr>
+        <w:t>c</w:t>
+      </w:r>
+      <w:r>
+        <w:rPr>
+          <w:b/>
+          <w:bCs/>
+          <w:lang w:val="en-US"/>
+        </w:rPr>
+        <w:t>onclusion:</w:t>
+      </w:r>
+      <w:r>
+        <w:rPr>
+          <w:lang w:val="en-US"/>
+        </w:rPr>
+        <w:t> Applying onnxruntime.quantization.shape_inference.quant_pre_process() with both shape inference and optimization enabled is a beneficial preparatory step. It improves the likelihood of successful and accurate quantization, aligns with best practices, potentially improves performance across the board, and creates a consistent baseline for comparing your different quantization strategies. Make sure to use the output of this pre-processing step for all subsequent evaluations and quantization procedures.</w:t>
+      </w:r>
+    </w:p>
+    <w:p>
+      <w:pPr>
+        <w:rPr>
+          <w:lang w:val="en-US"/>
+        </w:rPr>
+      </w:pPr>
+    </w:p>
+    <w:p>
+      <w:pPr>
+        <w:rPr>
+          <w:b/>
+          <w:bCs/>
+          <w:sz w:val="28"/>
+          <w:szCs w:val="28"/>
+          <w:lang w:val="en-US"/>
+        </w:rPr>
+      </w:pPr>
+      <w:r>
+        <w:rPr>
+          <w:b/>
+          <w:bCs/>
+          <w:sz w:val="28"/>
+          <w:szCs w:val="28"/>
+          <w:lang w:val="en-US"/>
+        </w:rPr>
+        <w:t>Hyperparameters of pre-processing</w:t>
+      </w:r>
+    </w:p>
+    <w:p>
+      <w:proofErr w:type="spellStart"/>
+      <w:r>
+        <w:rPr>
+          <w:b/>
+          <w:bCs/>
+        </w:rPr>
+        <w:t>Parameter</w:t>
+      </w:r>
+      <w:proofErr w:type="spellEnd"/>
+      <w:r>
+        <w:rPr>
+          <w:b/>
+          <w:bCs/>
+        </w:rPr>
+        <w:t xml:space="preserve"> </w:t>
+      </w:r>
+      <w:proofErr w:type="spellStart"/>
+      <w:r>
+        <w:rPr>
+          <w:b/>
+          <w:bCs/>
+        </w:rPr>
+        <w:t>Clarifications</w:t>
+      </w:r>
+      <w:proofErr w:type="spellEnd"/>
+      <w:r>
+        <w:rPr>
+          <w:b/>
+          <w:bCs/>
+        </w:rPr>
+        <w:t>:</w:t>
+      </w:r>
+    </w:p>
+    <w:p>
+      <w:pPr>
+        <w:numPr>
+          <w:ilvl w:val="0"/>
+          <w:numId w:val="7"/>
+        </w:numPr>
+        <w:rPr>
+          <w:lang w:val="en-US"/>
+        </w:rPr>
+      </w:pPr>
+      <w:proofErr w:type="spellStart"/>
+      <w:r>
+        <w:rPr>
+          <w:lang w:val="en-US"/>
+        </w:rPr>
+        <w:lastRenderedPageBreak/>
+        <w:t>input_model</w:t>
+      </w:r>
+      <w:proofErr w:type="spellEnd"/>
+      <w:r>
+        <w:rPr>
+          <w:lang w:val="en-US"/>
+        </w:rPr>
+        <w:t>: </w:t>
+      </w:r>
+      <w:r>
+        <w:rPr>
+          <w:b/>
+          <w:bCs/>
+          <w:lang w:val="en-US"/>
+        </w:rPr>
+        <w:t>What:</w:t>
+      </w:r>
+      <w:r>
+        <w:rPr>
+          <w:lang w:val="en-US"/>
+        </w:rPr>
+        <w:t xml:space="preserve"> The path to your original, un-processed ONNX model file (e.g., the one you exported directly from </w:t>
+      </w:r>
+      <w:proofErr w:type="spellStart"/>
+      <w:r>
+        <w:rPr>
+          <w:lang w:val="en-US"/>
+        </w:rPr>
+        <w:t>PyTorch</w:t>
+      </w:r>
+      <w:proofErr w:type="spellEnd"/>
+      <w:r>
+        <w:rPr>
+          <w:lang w:val="en-US"/>
+        </w:rPr>
+        <w:t>).</w:t>
+      </w:r>
+    </w:p>
+    <w:p>
+      <w:pPr>
+        <w:numPr>
+          <w:ilvl w:val="1"/>
+          <w:numId w:val="7"/>
+        </w:numPr>
+      </w:pPr>
+      <w:proofErr w:type="spellStart"/>
+      <w:r>
+        <w:rPr>
+          <w:b/>
+          <w:bCs/>
+        </w:rPr>
+        <w:t>Relevance</w:t>
+      </w:r>
+      <w:proofErr w:type="spellEnd"/>
+      <w:r>
+        <w:rPr>
+          <w:b/>
+          <w:bCs/>
+        </w:rPr>
+        <w:t>:</w:t>
+      </w:r>
+      <w:r>
+        <w:t> </w:t>
+      </w:r>
+      <w:proofErr w:type="spellStart"/>
+      <w:r>
+        <w:t>Mandatory</w:t>
+      </w:r>
+      <w:proofErr w:type="spellEnd"/>
+      <w:r>
+        <w:t xml:space="preserve"> </w:t>
+      </w:r>
+      <w:proofErr w:type="spellStart"/>
+      <w:r>
+        <w:t>input</w:t>
+      </w:r>
+      <w:proofErr w:type="spellEnd"/>
+      <w:r>
+        <w:t>.</w:t>
+      </w:r>
+    </w:p>
+    <w:p>
+      <w:pPr>
+        <w:numPr>
+          <w:ilvl w:val="0"/>
+          <w:numId w:val="7"/>
+        </w:numPr>
+        <w:rPr>
+          <w:lang w:val="en-US"/>
+        </w:rPr>
+      </w:pPr>
+      <w:proofErr w:type="spellStart"/>
+      <w:r>
+        <w:rPr>
+          <w:lang w:val="en-US"/>
+        </w:rPr>
+        <w:t>output_model_path</w:t>
+      </w:r>
+      <w:proofErr w:type="spellEnd"/>
+      <w:r>
+        <w:rPr>
+          <w:lang w:val="en-US"/>
+        </w:rPr>
+        <w:t>: </w:t>
+      </w:r>
+      <w:r>
+        <w:rPr>
+          <w:b/>
+          <w:bCs/>
+          <w:lang w:val="en-US"/>
+        </w:rPr>
+        <w:t>What:</w:t>
+      </w:r>
+      <w:r>
+        <w:rPr>
+          <w:lang w:val="en-US"/>
+        </w:rPr>
+        <w:t> The path where the function will save the new, processed ONNX model file.</w:t>
+      </w:r>
+    </w:p>
+    <w:p>
+      <w:pPr>
+        <w:numPr>
+          <w:ilvl w:val="1"/>
+          <w:numId w:val="7"/>
+        </w:numPr>
+      </w:pPr>
+      <w:proofErr w:type="spellStart"/>
+      <w:r>
+        <w:rPr>
+          <w:b/>
+          <w:bCs/>
+        </w:rPr>
+        <w:t>Relevance</w:t>
+      </w:r>
+      <w:proofErr w:type="spellEnd"/>
+      <w:r>
+        <w:rPr>
+          <w:b/>
+          <w:bCs/>
+        </w:rPr>
+        <w:t>:</w:t>
+      </w:r>
+      <w:r>
+        <w:t> </w:t>
+      </w:r>
+      <w:proofErr w:type="spellStart"/>
+      <w:r>
+        <w:t>Mandatory</w:t>
+      </w:r>
+      <w:proofErr w:type="spellEnd"/>
+      <w:r>
+        <w:t xml:space="preserve"> </w:t>
+      </w:r>
+      <w:proofErr w:type="spellStart"/>
+      <w:r>
+        <w:t>output</w:t>
+      </w:r>
+      <w:proofErr w:type="spellEnd"/>
+      <w:r>
+        <w:t xml:space="preserve"> </w:t>
+      </w:r>
+      <w:proofErr w:type="spellStart"/>
+      <w:r>
+        <w:t>path</w:t>
+      </w:r>
+      <w:proofErr w:type="spellEnd"/>
+      <w:r>
+        <w:t>.</w:t>
+      </w:r>
+    </w:p>
+    <w:p>
+      <w:pPr>
+        <w:numPr>
+          <w:ilvl w:val="0"/>
+          <w:numId w:val="7"/>
+        </w:numPr>
+        <w:rPr>
+          <w:lang w:val="en-US"/>
+        </w:rPr>
+      </w:pPr>
+      <w:proofErr w:type="spellStart"/>
+      <w:r>
+        <w:rPr>
+          <w:lang w:val="en-US"/>
+        </w:rPr>
+        <w:t>skip_optimization</w:t>
+      </w:r>
+      <w:proofErr w:type="spellEnd"/>
+      <w:r>
+        <w:rPr>
+          <w:lang w:val="en-US"/>
+        </w:rPr>
+        <w:t>: </w:t>
+      </w:r>
+      <w:r>
+        <w:rPr>
+          <w:b/>
+          <w:bCs/>
+          <w:lang w:val="en-US"/>
+        </w:rPr>
+        <w:t>What:</w:t>
+      </w:r>
+      <w:r>
+        <w:rPr>
+          <w:lang w:val="en-US"/>
+        </w:rPr>
+        <w:t> If set to True, it prevents the function from performing graph optimizations like operator fusion (e.g., merging Conv + BN) and removing redundancies.</w:t>
+      </w:r>
+    </w:p>
+    <w:p>
+      <w:pPr>
+        <w:numPr>
+          <w:ilvl w:val="1"/>
+          <w:numId w:val="7"/>
+        </w:numPr>
+      </w:pPr>
+      <w:r>
+        <w:rPr>
+          <w:b/>
+          <w:bCs/>
+          <w:lang w:val="en-US"/>
+        </w:rPr>
+        <w:t>Relevance:</w:t>
+      </w:r>
+      <w:r>
+        <w:rPr>
+          <w:lang w:val="en-US"/>
+        </w:rPr>
+        <w:t> Crucial. The documentation strongly recommends </w:t>
+      </w:r>
+      <w:r>
+        <w:rPr>
+          <w:i/>
+          <w:iCs/>
+          <w:lang w:val="en-US"/>
+        </w:rPr>
+        <w:t>doing</w:t>
+      </w:r>
+      <w:r>
+        <w:rPr>
+          <w:lang w:val="en-US"/>
+        </w:rPr>
+        <w:t> optimization (</w:t>
+      </w:r>
+      <w:proofErr w:type="spellStart"/>
+      <w:r>
+        <w:rPr>
+          <w:lang w:val="en-US"/>
+        </w:rPr>
+        <w:t>skip_optimization</w:t>
+      </w:r>
+      <w:proofErr w:type="spellEnd"/>
+      <w:r>
+        <w:rPr>
+          <w:lang w:val="en-US"/>
+        </w:rPr>
+        <w:t xml:space="preserve">=False) because it improves runtime efficiency and can make quantization more effective and easier to debug. </w:t>
+      </w:r>
+      <w:r>
+        <w:t xml:space="preserve">YOLOv8 </w:t>
+      </w:r>
+      <w:proofErr w:type="spellStart"/>
+      <w:r>
+        <w:t>benefits</w:t>
+      </w:r>
+      <w:proofErr w:type="spellEnd"/>
+      <w:r>
+        <w:t xml:space="preserve"> </w:t>
+      </w:r>
+      <w:proofErr w:type="spellStart"/>
+      <w:r>
+        <w:t>significantly</w:t>
+      </w:r>
+      <w:proofErr w:type="spellEnd"/>
+      <w:r>
+        <w:t xml:space="preserve"> </w:t>
+      </w:r>
+      <w:proofErr w:type="spellStart"/>
+      <w:r>
+        <w:t>from</w:t>
+      </w:r>
+      <w:proofErr w:type="spellEnd"/>
+      <w:r>
+        <w:t xml:space="preserve"> </w:t>
+      </w:r>
+      <w:proofErr w:type="spellStart"/>
+      <w:r>
+        <w:t>fusions</w:t>
+      </w:r>
+      <w:proofErr w:type="spellEnd"/>
+      <w:r>
+        <w:t xml:space="preserve"> </w:t>
+      </w:r>
+      <w:proofErr w:type="spellStart"/>
+      <w:r>
+        <w:t>like</w:t>
+      </w:r>
+      <w:proofErr w:type="spellEnd"/>
+      <w:r>
+        <w:t xml:space="preserve"> </w:t>
+      </w:r>
+      <w:proofErr w:type="spellStart"/>
+      <w:r>
+        <w:t>Conv+BN</w:t>
+      </w:r>
+      <w:proofErr w:type="spellEnd"/>
+      <w:r>
+        <w:t>.</w:t>
+      </w:r>
+    </w:p>
+    <w:p>
+      <w:pPr>
+        <w:numPr>
+          <w:ilvl w:val="0"/>
+          <w:numId w:val="7"/>
+        </w:numPr>
+        <w:rPr>
+          <w:lang w:val="en-US"/>
+        </w:rPr>
+      </w:pPr>
+      <w:proofErr w:type="spellStart"/>
+      <w:r>
+        <w:rPr>
+          <w:lang w:val="en-US"/>
+        </w:rPr>
+        <w:t>skip_onnx_shape</w:t>
+      </w:r>
+      <w:proofErr w:type="spellEnd"/>
+      <w:r>
+        <w:rPr>
+          <w:lang w:val="en-US"/>
+        </w:rPr>
+        <w:t>: </w:t>
+      </w:r>
+      <w:r>
+        <w:rPr>
+          <w:b/>
+          <w:bCs/>
+          <w:lang w:val="en-US"/>
+        </w:rPr>
+        <w:t>What:</w:t>
+      </w:r>
+      <w:r>
+        <w:rPr>
+          <w:lang w:val="en-US"/>
+        </w:rPr>
+        <w:t> If set to True, it prevents the standard ONNX shape inference process. This process tries to determine the shapes (dimensions) of all tensors in the graph.</w:t>
+      </w:r>
+    </w:p>
+    <w:p>
+      <w:pPr>
+        <w:numPr>
+          <w:ilvl w:val="1"/>
+          <w:numId w:val="7"/>
+        </w:numPr>
+        <w:rPr>
+          <w:lang w:val="en-US"/>
+        </w:rPr>
+      </w:pPr>
+      <w:r>
+        <w:rPr>
+          <w:b/>
+          <w:bCs/>
+          <w:lang w:val="en-US"/>
+        </w:rPr>
+        <w:t>Relevance:</w:t>
+      </w:r>
+      <w:r>
+        <w:rPr>
+          <w:lang w:val="en-US"/>
+        </w:rPr>
+        <w:t> Important. Knowing tensor shapes is very helpful for quantization tools. Skipping this might hinder the quantization process. The documentation suggests </w:t>
+      </w:r>
+      <w:r>
+        <w:rPr>
+          <w:i/>
+          <w:iCs/>
+          <w:lang w:val="en-US"/>
+        </w:rPr>
+        <w:t>not</w:t>
+      </w:r>
+      <w:r>
+        <w:rPr>
+          <w:lang w:val="en-US"/>
+        </w:rPr>
+        <w:t> skipping this for general models.</w:t>
+      </w:r>
+    </w:p>
+    <w:p>
+      <w:pPr>
+        <w:numPr>
+          <w:ilvl w:val="0"/>
+          <w:numId w:val="7"/>
+        </w:numPr>
+        <w:rPr>
+          <w:lang w:val="en-US"/>
+        </w:rPr>
+      </w:pPr>
+      <w:proofErr w:type="spellStart"/>
+      <w:r>
+        <w:rPr>
+          <w:lang w:val="en-US"/>
+        </w:rPr>
+        <w:t>skip_symbolic_shape</w:t>
+      </w:r>
+      <w:proofErr w:type="spellEnd"/>
+      <w:r>
+        <w:rPr>
+          <w:lang w:val="en-US"/>
+        </w:rPr>
+        <w:t>: </w:t>
+      </w:r>
+      <w:r>
+        <w:rPr>
+          <w:b/>
+          <w:bCs/>
+          <w:lang w:val="en-US"/>
+        </w:rPr>
+        <w:t>What:</w:t>
+      </w:r>
+      <w:r>
+        <w:rPr>
+          <w:lang w:val="en-US"/>
+        </w:rPr>
+        <w:t> If set to True, it prevents a more advanced symbolic shape inference, which is noted as being "most effective with transformer based models."</w:t>
+      </w:r>
+    </w:p>
+    <w:p>
+      <w:pPr>
+        <w:numPr>
+          <w:ilvl w:val="1"/>
+          <w:numId w:val="7"/>
+        </w:numPr>
+        <w:rPr>
+          <w:lang w:val="en-US"/>
+        </w:rPr>
+      </w:pPr>
+      <w:r>
+        <w:rPr>
+          <w:b/>
+          <w:bCs/>
+          <w:lang w:val="en-US"/>
+        </w:rPr>
+        <w:t>Relevance:</w:t>
+      </w:r>
+      <w:r>
+        <w:rPr>
+          <w:lang w:val="en-US"/>
+        </w:rPr>
+        <w:t> Less critical for CNNs like YOLOv8. Standard ONNX shape inference (</w:t>
+      </w:r>
+      <w:proofErr w:type="spellStart"/>
+      <w:r>
+        <w:rPr>
+          <w:lang w:val="en-US"/>
+        </w:rPr>
+        <w:t>skip_onnx_shape</w:t>
+      </w:r>
+      <w:proofErr w:type="spellEnd"/>
+      <w:r>
+        <w:rPr>
+          <w:lang w:val="en-US"/>
+        </w:rPr>
+        <w:t>=False) is usually sufficient. Running symbolic inference might be unnecessary overhead or potentially less stable for non-transformer architectures.</w:t>
+      </w:r>
+    </w:p>
+    <w:p>
+      <w:pPr>
+        <w:numPr>
+          <w:ilvl w:val="0"/>
+          <w:numId w:val="7"/>
+        </w:numPr>
+      </w:pPr>
+      <w:proofErr w:type="spellStart"/>
+      <w:r>
+        <w:rPr>
+          <w:lang w:val="en-US"/>
+        </w:rPr>
+        <w:t>auto_merge</w:t>
+      </w:r>
+      <w:proofErr w:type="spellEnd"/>
+      <w:r>
+        <w:rPr>
+          <w:lang w:val="en-US"/>
+        </w:rPr>
+        <w:t>: </w:t>
+      </w:r>
+      <w:r>
+        <w:rPr>
+          <w:b/>
+          <w:bCs/>
+          <w:lang w:val="en-US"/>
+        </w:rPr>
+        <w:t>What:</w:t>
+      </w:r>
+      <w:r>
+        <w:rPr>
+          <w:lang w:val="en-US"/>
+        </w:rPr>
+        <w:t xml:space="preserve"> Related only to symbolic shape inference. </w:t>
+      </w:r>
+      <w:proofErr w:type="spellStart"/>
+      <w:r>
+        <w:t>Handles</w:t>
+      </w:r>
+      <w:proofErr w:type="spellEnd"/>
+      <w:r>
+        <w:t xml:space="preserve"> </w:t>
+      </w:r>
+      <w:proofErr w:type="spellStart"/>
+      <w:r>
+        <w:t>conflicting</w:t>
+      </w:r>
+      <w:proofErr w:type="spellEnd"/>
+      <w:r>
+        <w:t xml:space="preserve"> </w:t>
+      </w:r>
+      <w:proofErr w:type="spellStart"/>
+      <w:r>
+        <w:t>dimension</w:t>
+      </w:r>
+      <w:proofErr w:type="spellEnd"/>
+      <w:r>
+        <w:t xml:space="preserve"> </w:t>
+      </w:r>
+      <w:proofErr w:type="spellStart"/>
+      <w:r>
+        <w:t>interpretations</w:t>
+      </w:r>
+      <w:proofErr w:type="spellEnd"/>
+      <w:r>
+        <w:t>.</w:t>
+      </w:r>
+    </w:p>
+    <w:p>
+      <w:pPr>
+        <w:numPr>
+          <w:ilvl w:val="1"/>
+          <w:numId w:val="7"/>
+        </w:numPr>
+        <w:rPr>
+          <w:lang w:val="en-US"/>
+        </w:rPr>
+      </w:pPr>
+      <w:r>
+        <w:rPr>
+          <w:b/>
+          <w:bCs/>
+          <w:lang w:val="en-US"/>
+        </w:rPr>
+        <w:t>Relevance:</w:t>
+      </w:r>
+      <w:r>
+        <w:rPr>
+          <w:lang w:val="en-US"/>
+        </w:rPr>
+        <w:t> Only matters if </w:t>
+      </w:r>
+      <w:proofErr w:type="spellStart"/>
+      <w:r>
+        <w:rPr>
+          <w:lang w:val="en-US"/>
+        </w:rPr>
+        <w:t>skip_symbolic_shape</w:t>
+      </w:r>
+      <w:proofErr w:type="spellEnd"/>
+      <w:r>
+        <w:rPr>
+          <w:lang w:val="en-US"/>
+        </w:rPr>
+        <w:t>=False.</w:t>
+      </w:r>
+    </w:p>
+    <w:p>
+      <w:pPr>
+        <w:numPr>
+          <w:ilvl w:val="0"/>
+          <w:numId w:val="7"/>
+        </w:numPr>
+        <w:rPr>
+          <w:lang w:val="en-US"/>
+        </w:rPr>
+      </w:pPr>
+      <w:proofErr w:type="spellStart"/>
+      <w:r>
+        <w:rPr>
+          <w:lang w:val="en-US"/>
+        </w:rPr>
+        <w:t>int_max</w:t>
+      </w:r>
+      <w:proofErr w:type="spellEnd"/>
+      <w:r>
+        <w:rPr>
+          <w:lang w:val="en-US"/>
+        </w:rPr>
+        <w:t>: </w:t>
+      </w:r>
+      <w:r>
+        <w:rPr>
+          <w:b/>
+          <w:bCs/>
+          <w:lang w:val="en-US"/>
+        </w:rPr>
+        <w:t>What:</w:t>
+      </w:r>
+      <w:r>
+        <w:rPr>
+          <w:lang w:val="en-US"/>
+        </w:rPr>
+        <w:t> Related only to symbolic shape inference. Defines a threshold for integer values in certain operations.</w:t>
+      </w:r>
+    </w:p>
+    <w:p>
+      <w:pPr>
+        <w:numPr>
+          <w:ilvl w:val="1"/>
+          <w:numId w:val="7"/>
+        </w:numPr>
+        <w:rPr>
+          <w:lang w:val="en-US"/>
+        </w:rPr>
+      </w:pPr>
+      <w:r>
+        <w:rPr>
+          <w:b/>
+          <w:bCs/>
+          <w:lang w:val="en-US"/>
+        </w:rPr>
+        <w:t>Relevance:</w:t>
+      </w:r>
+      <w:r>
+        <w:rPr>
+          <w:lang w:val="en-US"/>
+        </w:rPr>
+        <w:t> Only matters if </w:t>
+      </w:r>
+      <w:proofErr w:type="spellStart"/>
+      <w:r>
+        <w:rPr>
+          <w:lang w:val="en-US"/>
+        </w:rPr>
+        <w:t>skip_symbolic_shape</w:t>
+      </w:r>
+      <w:proofErr w:type="spellEnd"/>
+      <w:r>
+        <w:rPr>
+          <w:lang w:val="en-US"/>
+        </w:rPr>
+        <w:t>=False.</w:t>
+      </w:r>
+    </w:p>
+    <w:p>
+      <w:pPr>
+        <w:numPr>
+          <w:ilvl w:val="0"/>
+          <w:numId w:val="7"/>
+        </w:numPr>
+        <w:rPr>
+          <w:lang w:val="en-US"/>
+        </w:rPr>
+      </w:pPr>
+      <w:proofErr w:type="spellStart"/>
+      <w:r>
+        <w:rPr>
+          <w:lang w:val="en-US"/>
+        </w:rPr>
+        <w:t>guess_output_rank</w:t>
+      </w:r>
+      <w:proofErr w:type="spellEnd"/>
+      <w:r>
+        <w:rPr>
+          <w:lang w:val="en-US"/>
+        </w:rPr>
+        <w:t>: </w:t>
+      </w:r>
+      <w:r>
+        <w:rPr>
+          <w:b/>
+          <w:bCs/>
+          <w:lang w:val="en-US"/>
+        </w:rPr>
+        <w:t>What:</w:t>
+      </w:r>
+      <w:r>
+        <w:rPr>
+          <w:lang w:val="en-US"/>
+        </w:rPr>
+        <w:t> A fallback mechanism for shape inference if it encounters an unknown operator type. It assumes the output tensor has the same number of dimensions (rank) as the first input tensor.</w:t>
+      </w:r>
+    </w:p>
+    <w:p>
+      <w:pPr>
+        <w:numPr>
+          <w:ilvl w:val="1"/>
+          <w:numId w:val="7"/>
+        </w:numPr>
+        <w:rPr>
+          <w:lang w:val="en-US"/>
+        </w:rPr>
+      </w:pPr>
+      <w:r>
+        <w:rPr>
+          <w:b/>
+          <w:bCs/>
+          <w:lang w:val="en-US"/>
+        </w:rPr>
+        <w:lastRenderedPageBreak/>
+        <w:t>Relevance:</w:t>
+      </w:r>
+      <w:r>
+        <w:rPr>
+          <w:lang w:val="en-US"/>
+        </w:rPr>
+        <w:t> Generally safer to rely on explicit shape inference working correctly. Setting this to True might hide underlying issues or make incorrect assumptions if an op is truly problematic. Default (False) is usually better unless you encounter specific errors related to unknown ops.</w:t>
+      </w:r>
+    </w:p>
+    <w:p>
+      <w:pPr>
+        <w:numPr>
+          <w:ilvl w:val="0"/>
+          <w:numId w:val="7"/>
+        </w:numPr>
+        <w:rPr>
+          <w:lang w:val="en-US"/>
+        </w:rPr>
+      </w:pPr>
+      <w:r>
+        <w:rPr>
+          <w:lang w:val="en-US"/>
+        </w:rPr>
+        <w:t>verbose: </w:t>
+      </w:r>
+      <w:r>
+        <w:rPr>
+          <w:b/>
+          <w:bCs/>
+          <w:lang w:val="en-US"/>
+        </w:rPr>
+        <w:t>What:</w:t>
+      </w:r>
+      <w:r>
+        <w:rPr>
+          <w:lang w:val="en-US"/>
+        </w:rPr>
+        <w:t> Controls how much information is printed during the process (0=off, 1=warnings, 3=detailed).</w:t>
+      </w:r>
+    </w:p>
+    <w:p>
+      <w:pPr>
+        <w:numPr>
+          <w:ilvl w:val="1"/>
+          <w:numId w:val="7"/>
+        </w:numPr>
+        <w:rPr>
+          <w:lang w:val="en-US"/>
+        </w:rPr>
+      </w:pPr>
+      <w:r>
+        <w:rPr>
+          <w:b/>
+          <w:bCs/>
+          <w:lang w:val="en-US"/>
+        </w:rPr>
+        <w:t>Relevance:</w:t>
+      </w:r>
+      <w:r>
+        <w:rPr>
+          <w:lang w:val="en-US"/>
+        </w:rPr>
+        <w:t> Useful for monitoring and debugging.</w:t>
+      </w:r>
+    </w:p>
+    <w:p>
+      <w:pPr>
+        <w:numPr>
+          <w:ilvl w:val="0"/>
+          <w:numId w:val="7"/>
+        </w:numPr>
+        <w:rPr>
+          <w:lang w:val="en-US"/>
+        </w:rPr>
+      </w:pPr>
+      <w:r>
+        <w:rPr>
+          <w:lang w:val="en-US"/>
+        </w:rPr>
+        <w:t>save_as_external_data / all_tensors_to_one_file / external_data_location / external_data_size_threshold: </w:t>
+      </w:r>
+      <w:r>
+        <w:rPr>
+          <w:b/>
+          <w:bCs/>
+          <w:lang w:val="en-US"/>
+        </w:rPr>
+        <w:t>What:</w:t>
+      </w:r>
+      <w:r>
+        <w:rPr>
+          <w:lang w:val="en-US"/>
+        </w:rPr>
+        <w:t xml:space="preserve"> Options for handling very large models (&gt;2GB </w:t>
+      </w:r>
+      <w:proofErr w:type="spellStart"/>
+      <w:r>
+        <w:rPr>
+          <w:lang w:val="en-US"/>
+        </w:rPr>
+        <w:t>protobuf</w:t>
+      </w:r>
+      <w:proofErr w:type="spellEnd"/>
+      <w:r>
+        <w:rPr>
+          <w:lang w:val="en-US"/>
+        </w:rPr>
+        <w:t xml:space="preserve"> limit) by saving tensor weights to separate files.</w:t>
+      </w:r>
+    </w:p>
+    <w:p>
+      <w:pPr>
+        <w:numPr>
+          <w:ilvl w:val="1"/>
+          <w:numId w:val="7"/>
+        </w:numPr>
+        <w:rPr>
+          <w:lang w:val="en-US"/>
+        </w:rPr>
+      </w:pPr>
+      <w:r>
+        <w:rPr>
+          <w:b/>
+          <w:bCs/>
+          <w:lang w:val="en-US"/>
+        </w:rPr>
+        <w:t>Relevance:</w:t>
+      </w:r>
+      <w:r>
+        <w:rPr>
+          <w:lang w:val="en-US"/>
+        </w:rPr>
+        <w:t> Not relevant for YOLOv8n, which is much smaller than 2GB.</w:t>
+      </w:r>
+    </w:p>
+    <w:p>
+      <w:pPr>
+        <w:rPr>
+          <w:lang w:val="en-US"/>
+        </w:rPr>
+      </w:pPr>
+    </w:p>
+    <w:p>
+      <w:pPr>
+        <w:rPr>
+          <w:lang w:val="en-US"/>
+        </w:rPr>
+      </w:pPr>
+    </w:p>
+    <w:p>
+      <w:pPr>
+        <w:rPr>
+          <w:lang w:val="en-US"/>
+        </w:rPr>
+      </w:pPr>
+    </w:p>
+    <w:p>
+      <w:pPr>
+        <w:rPr>
+          <w:lang w:val="en-US"/>
+        </w:rPr>
+      </w:pPr>
+    </w:p>
+    <w:p>
+      <w:pPr>
+        <w:rPr>
+          <w:lang w:val="en-US"/>
+        </w:rPr>
+      </w:pPr>
+    </w:p>
+    <w:p>
+      <w:pPr>
+        <w:rPr>
+          <w:lang w:val="en-US"/>
+        </w:rPr>
+      </w:pPr>
+    </w:p>
+    <w:p>
+      <w:pPr>
+        <w:rPr>
+          <w:lang w:val="en-US"/>
+        </w:rPr>
+      </w:pPr>
+    </w:p>
+    <w:p>
+      <w:pPr>
+        <w:rPr>
+          <w:lang w:val="en-US"/>
+        </w:rPr>
+      </w:pPr>
+    </w:p>
+    <w:p>
+      <w:pPr>
+        <w:rPr>
+          <w:lang w:val="en-US"/>
+        </w:rPr>
+      </w:pPr>
+    </w:p>
+    <w:p>
+      <w:pPr>
+        <w:rPr>
+          <w:lang w:val="en-US"/>
+        </w:rPr>
+      </w:pPr>
+    </w:p>
+    <w:p>
+      <w:pPr>
+        <w:rPr>
+          <w:lang w:val="en-US"/>
+        </w:rPr>
+      </w:pPr>
+    </w:p>
+    <w:p>
+      <w:pPr>
+        <w:rPr>
+          <w:lang w:val="en-US"/>
+        </w:rPr>
+      </w:pPr>
+    </w:p>
+    <w:p>
+      <w:pPr>
+        <w:rPr>
+          <w:lang w:val="en-US"/>
+        </w:rPr>
+      </w:pPr>
+    </w:p>
+    <w:p>
+      <w:pPr>
+        <w:rPr>
+          <w:lang w:val="en-US"/>
+        </w:rPr>
+      </w:pPr>
+    </w:p>
+    <w:p>
+      <w:pPr>
+        <w:rPr>
+          <w:lang w:val="en-US"/>
+        </w:rPr>
+      </w:pPr>
+    </w:p>
+    <w:p>
+      <w:pPr>
+        <w:rPr>
+          <w:lang w:val="en-US"/>
+        </w:rPr>
+      </w:pPr>
+    </w:p>
+    <w:p>
+      <w:pPr>
+        <w:rPr>
+          <w:lang w:val="en-US"/>
+        </w:rPr>
+      </w:pPr>
+    </w:p>
+    <w:p>
+      <w:pPr>
+        <w:rPr>
+          <w:lang w:val="en-US"/>
+        </w:rPr>
+      </w:pPr>
+    </w:p>
+    <w:p>
+      <w:pPr>
+        <w:rPr>
+          <w:lang w:val="en-US"/>
+        </w:rPr>
+      </w:pPr>
+    </w:p>
+    <w:p>
+      <w:pPr>
+        <w:rPr>
+          <w:lang w:val="en-US"/>
+        </w:rPr>
+      </w:pPr>
+    </w:p>
+    <w:p>
+      <w:pPr>
+        <w:jc w:val="center"/>
+        <w:rPr>
+          <w:b/>
+          <w:bCs/>
+          <w:sz w:val="28"/>
+          <w:szCs w:val="28"/>
+          <w:lang w:val="en-US"/>
+        </w:rPr>
+      </w:pPr>
+      <w:r>
+        <w:rPr>
+          <w:b/>
+          <w:bCs/>
+          <w:sz w:val="28"/>
+          <w:szCs w:val="28"/>
+          <w:lang w:val="en-US"/>
+        </w:rPr>
+        <w:lastRenderedPageBreak/>
+        <w:t>DYNAMIC QUANTIZATION WORKS ONLY IN INT8</w:t>
+      </w:r>
+      <w:r>
+        <w:rPr>
+          <w:b/>
+          <w:bCs/>
+          <w:sz w:val="28"/>
+          <w:szCs w:val="28"/>
+          <w:lang w:val="en-US"/>
+        </w:rPr>
+        <w:t xml:space="preserve"> ACROSS ALL FRAMEWORKS</w:t>
+      </w:r>
+      <w:r>
+        <w:rPr>
+          <w:b/>
+          <w:bCs/>
+          <w:sz w:val="28"/>
+          <w:szCs w:val="28"/>
+          <w:lang w:val="en-US"/>
+        </w:rPr>
+        <w:t xml:space="preserve"> (including ONNX)</w:t>
+      </w:r>
+    </w:p>
+    <w:p>
+      <w:pPr>
+        <w:rPr>
+          <w:lang w:val="en-US"/>
+        </w:rPr>
+      </w:pPr>
+      <w:r>
+        <w:rPr>
+          <w:b/>
+          <w:bCs/>
+          <w:lang w:val="en-US"/>
+        </w:rPr>
+        <w:t>I</w:t>
+      </w:r>
+      <w:r>
+        <w:rPr>
+          <w:b/>
+          <w:bCs/>
+          <w:lang w:val="en-US"/>
+        </w:rPr>
+        <w:t>t's not possible to achieve true </w:t>
+      </w:r>
+      <w:r>
+        <w:rPr>
+          <w:b/>
+          <w:bCs/>
+          <w:i/>
+          <w:iCs/>
+          <w:lang w:val="en-US"/>
+        </w:rPr>
+        <w:t>dynamic</w:t>
+      </w:r>
+      <w:r>
+        <w:rPr>
+          <w:b/>
+          <w:bCs/>
+          <w:lang w:val="en-US"/>
+        </w:rPr>
+        <w:t> quantization using INT4, INT16, or FP8 with the standard </w:t>
+      </w:r>
+      <w:proofErr w:type="spellStart"/>
+      <w:r>
+        <w:rPr>
+          <w:b/>
+          <w:bCs/>
+          <w:lang w:val="en-US"/>
+        </w:rPr>
+        <w:t>onnxruntime.quantization.quantize_dynamic</w:t>
+      </w:r>
+      <w:proofErr w:type="spellEnd"/>
+      <w:r>
+        <w:rPr>
+          <w:b/>
+          <w:bCs/>
+          <w:lang w:val="en-US"/>
+        </w:rPr>
+        <w:t> function and standard ONNX Runtime execution.</w:t>
+      </w:r>
+    </w:p>
+    <w:p>
+      <w:pPr>
+        <w:rPr>
+          <w:lang w:val="en-US"/>
+        </w:rPr>
+      </w:pPr>
+      <w:r>
+        <w:rPr>
+          <w:b/>
+          <w:bCs/>
+          <w:lang w:val="en-US"/>
+        </w:rPr>
+        <w:t>Why? The problem is deep and multi-faceted:</w:t>
+      </w:r>
+    </w:p>
+    <w:p>
+      <w:pPr>
+        <w:numPr>
+          <w:ilvl w:val="0"/>
+          <w:numId w:val="8"/>
+        </w:numPr>
+        <w:rPr>
+          <w:lang w:val="en-US"/>
+        </w:rPr>
+      </w:pPr>
+      <w:r>
+        <w:rPr>
+          <w:b/>
+          <w:bCs/>
+          <w:lang w:val="en-US"/>
+        </w:rPr>
+        <w:t>Mismatched Operator Generation:</w:t>
+      </w:r>
+      <w:r>
+        <w:rPr>
+          <w:lang w:val="en-US"/>
+        </w:rPr>
+        <w:t> As the error</w:t>
+      </w:r>
+      <w:r>
+        <w:rPr>
+          <w:lang w:val="en-US"/>
+        </w:rPr>
+        <w:t xml:space="preserve"> </w:t>
+      </w:r>
+      <w:r>
+        <w:rPr>
+          <w:lang w:val="en-US"/>
+        </w:rPr>
+        <w:t>showed, </w:t>
+      </w:r>
+      <w:proofErr w:type="spellStart"/>
+      <w:r>
+        <w:rPr>
+          <w:lang w:val="en-US"/>
+        </w:rPr>
+        <w:t>quantize_dynamic</w:t>
+      </w:r>
+      <w:proofErr w:type="spellEnd"/>
+      <w:r>
+        <w:rPr>
+          <w:lang w:val="en-US"/>
+        </w:rPr>
+        <w:t> converts the weights correctly </w:t>
+      </w:r>
+      <w:r>
+        <w:rPr>
+          <w:i/>
+          <w:iCs/>
+          <w:lang w:val="en-US"/>
+        </w:rPr>
+        <w:t>offline</w:t>
+      </w:r>
+      <w:r>
+        <w:rPr>
+          <w:lang w:val="en-US"/>
+        </w:rPr>
+        <w:t> but still structures the graph using operators (like ConvInteger) that are explicitly defined in the ONNX standard to work with </w:t>
+      </w:r>
+      <w:r>
+        <w:rPr>
+          <w:b/>
+          <w:bCs/>
+          <w:lang w:val="en-US"/>
+        </w:rPr>
+        <w:t>INT8</w:t>
+      </w:r>
+      <w:r>
+        <w:rPr>
+          <w:lang w:val="en-US"/>
+        </w:rPr>
+        <w:t> weights and activations. It doesn't generate a graph with operators designed for INT4, INT16, or FP8 weights in a dynamic context.</w:t>
+      </w:r>
+    </w:p>
+    <w:p>
+      <w:pPr>
+        <w:numPr>
+          <w:ilvl w:val="0"/>
+          <w:numId w:val="8"/>
+        </w:numPr>
+        <w:rPr>
+          <w:lang w:val="en-US"/>
+        </w:rPr>
+      </w:pPr>
+      <w:r>
+        <w:rPr>
+          <w:b/>
+          <w:bCs/>
+          <w:lang w:val="en-US"/>
+        </w:rPr>
+        <w:t>Lack of Standard Dynamic Operators:</w:t>
+      </w:r>
+      <w:r>
+        <w:rPr>
+          <w:lang w:val="en-US"/>
+        </w:rPr>
+        <w:t> The core of dynamic quantization relies on runtime operators like </w:t>
+      </w:r>
+      <w:proofErr w:type="spellStart"/>
+      <w:r>
+        <w:rPr>
+          <w:lang w:val="en-US"/>
+        </w:rPr>
+        <w:t>DynamicQuantizeLinear</w:t>
+      </w:r>
+      <w:proofErr w:type="spellEnd"/>
+      <w:r>
+        <w:rPr>
+          <w:lang w:val="en-US"/>
+        </w:rPr>
+        <w:t> to quantize activations </w:t>
+      </w:r>
+      <w:r>
+        <w:rPr>
+          <w:i/>
+          <w:iCs/>
+          <w:lang w:val="en-US"/>
+        </w:rPr>
+        <w:t>on-the-fly</w:t>
+      </w:r>
+      <w:r>
+        <w:rPr>
+          <w:lang w:val="en-US"/>
+        </w:rPr>
+        <w:t>. The standard implementation of this operator outputs INT8/UINT8. There aren't standard, widely supported ONNX operators for dynamically quantizing activations to INT4, INT16, or FP8.</w:t>
+      </w:r>
+    </w:p>
+    <w:p>
+      <w:pPr>
+        <w:numPr>
+          <w:ilvl w:val="0"/>
+          <w:numId w:val="8"/>
+        </w:numPr>
+        <w:rPr>
+          <w:lang w:val="en-US"/>
+        </w:rPr>
+      </w:pPr>
+      <w:r>
+        <w:rPr>
+          <w:b/>
+          <w:bCs/>
+          <w:lang w:val="en-US"/>
+        </w:rPr>
+        <w:t>Lack of Runtime Kernel Support:</w:t>
+      </w:r>
+      <w:r>
+        <w:rPr>
+          <w:lang w:val="en-US"/>
+        </w:rPr>
+        <w:t> Even if you could somehow generate a graph </w:t>
+      </w:r>
+      <w:r>
+        <w:rPr>
+          <w:i/>
+          <w:iCs/>
+          <w:lang w:val="en-US"/>
+        </w:rPr>
+        <w:t>requesting</w:t>
+      </w:r>
+      <w:r>
+        <w:rPr>
+          <w:lang w:val="en-US"/>
+        </w:rPr>
+        <w:t> dynamic INT4/INT16/FP8 operations, the ONNX Runtime execution providers (CPU, CUDA) don't have the built-in, optimized kernels to perform these operations efficiently or correctly in a dynamic manner. Kernels for ConvInteger, </w:t>
+      </w:r>
+      <w:proofErr w:type="spellStart"/>
+      <w:r>
+        <w:rPr>
+          <w:lang w:val="en-US"/>
+        </w:rPr>
+        <w:t>MatMulInteger</w:t>
+      </w:r>
+      <w:proofErr w:type="spellEnd"/>
+      <w:r>
+        <w:rPr>
+          <w:lang w:val="en-US"/>
+        </w:rPr>
+        <w:t>, etc., are specifically implemented for INT8.</w:t>
+      </w:r>
+    </w:p>
+    <w:p>
+      <w:pPr>
+        <w:rPr>
+          <w:lang w:val="en-US"/>
+        </w:rPr>
+      </w:pPr>
+      <w:r>
+        <w:rPr>
+          <w:b/>
+          <w:bCs/>
+          <w:lang w:val="en-US"/>
+        </w:rPr>
+        <w:t>In essence:</w:t>
+      </w:r>
+      <w:r>
+        <w:rPr>
+          <w:lang w:val="en-US"/>
+        </w:rPr>
+        <w:t> The </w:t>
+      </w:r>
+      <w:proofErr w:type="spellStart"/>
+      <w:r>
+        <w:rPr>
+          <w:lang w:val="en-US"/>
+        </w:rPr>
+        <w:t>quantize_dynamic</w:t>
+      </w:r>
+      <w:proofErr w:type="spellEnd"/>
+      <w:r>
+        <w:rPr>
+          <w:lang w:val="en-US"/>
+        </w:rPr>
+        <w:t> tool and the ONNX Runtime inference engine are tightly coupled around the concept of using INT8 for dynamic quantization. The infrastructure (operator definitions, kernel implementations) simply isn't there for other data types </w:t>
+      </w:r>
+      <w:r>
+        <w:rPr>
+          <w:i/>
+          <w:iCs/>
+          <w:lang w:val="en-US"/>
+        </w:rPr>
+        <w:t>in the dynamic quantization flow</w:t>
+      </w:r>
+      <w:r>
+        <w:rPr>
+          <w:lang w:val="en-US"/>
+        </w:rPr>
+        <w:t>.</w:t>
+      </w:r>
+    </w:p>
+    <w:p>
+      <w:pPr>
+        <w:rPr>
+          <w:lang w:val="en-US"/>
+        </w:rPr>
+      </w:pPr>
+      <w:r>
+        <w:rPr>
+          <w:b/>
+          <w:bCs/>
+          <w:lang w:val="en-US"/>
+        </w:rPr>
+        <w:t>So, what are the alternatives if you </w:t>
+      </w:r>
+      <w:r>
+        <w:rPr>
+          <w:b/>
+          <w:bCs/>
+          <w:i/>
+          <w:iCs/>
+          <w:lang w:val="en-US"/>
+        </w:rPr>
+        <w:t>really</w:t>
+      </w:r>
+      <w:r>
+        <w:rPr>
+          <w:b/>
+          <w:bCs/>
+          <w:lang w:val="en-US"/>
+        </w:rPr>
+        <w:t> need INT4/FP8?</w:t>
+      </w:r>
+    </w:p>
+    <w:p>
+      <w:pPr>
+        <w:rPr>
+          <w:lang w:val="en-US"/>
+        </w:rPr>
+      </w:pPr>
+      <w:r>
+        <w:rPr>
+          <w:lang w:val="en-US"/>
+        </w:rPr>
+        <w:t>The path forward for these lower-precision types in the ONNX ecosystem is primarily through </w:t>
+      </w:r>
+      <w:r>
+        <w:rPr>
+          <w:b/>
+          <w:bCs/>
+          <w:lang w:val="en-US"/>
+        </w:rPr>
+        <w:t>Static Quantization (using the QDQ format):</w:t>
+      </w:r>
+    </w:p>
+    <w:p>
+      <w:pPr>
+        <w:numPr>
+          <w:ilvl w:val="0"/>
+          <w:numId w:val="9"/>
+        </w:numPr>
+        <w:rPr>
+          <w:lang w:val="en-US"/>
+        </w:rPr>
+      </w:pPr>
+      <w:r>
+        <w:rPr>
+          <w:b/>
+          <w:bCs/>
+          <w:lang w:val="en-US"/>
+        </w:rPr>
+        <w:t>Static Quantization (QDQ):</w:t>
+      </w:r>
+      <w:r>
+        <w:rPr>
+          <w:lang w:val="en-US"/>
+        </w:rPr>
+        <w:t> This is the standard approach for INT4 and FP8.</w:t>
+      </w:r>
+    </w:p>
+    <w:p>
+      <w:pPr>
+        <w:numPr>
+          <w:ilvl w:val="1"/>
+          <w:numId w:val="9"/>
+        </w:numPr>
+        <w:rPr>
+          <w:lang w:val="en-US"/>
+        </w:rPr>
+      </w:pPr>
+      <w:r>
+        <w:rPr>
+          <w:lang w:val="en-US"/>
+        </w:rPr>
+        <w:t>You use </w:t>
+      </w:r>
+      <w:proofErr w:type="spellStart"/>
+      <w:r>
+        <w:rPr>
+          <w:lang w:val="en-US"/>
+        </w:rPr>
+        <w:t>quantize_static</w:t>
+      </w:r>
+      <w:proofErr w:type="spellEnd"/>
+      <w:r>
+        <w:rPr>
+          <w:lang w:val="en-US"/>
+        </w:rPr>
+        <w:t> (or other tools like Olive, vendor SDKs).</w:t>
+      </w:r>
+    </w:p>
+    <w:p>
+      <w:pPr>
+        <w:numPr>
+          <w:ilvl w:val="1"/>
+          <w:numId w:val="9"/>
+        </w:numPr>
+        <w:rPr>
+          <w:lang w:val="en-US"/>
+        </w:rPr>
+      </w:pPr>
+      <w:r>
+        <w:rPr>
+          <w:lang w:val="en-US"/>
+        </w:rPr>
+        <w:t>It requires calibration data (like standard INT8 static PTQ).</w:t>
+      </w:r>
+    </w:p>
+    <w:p>
+      <w:pPr>
+        <w:numPr>
+          <w:ilvl w:val="1"/>
+          <w:numId w:val="9"/>
+        </w:numPr>
+        <w:rPr>
+          <w:lang w:val="en-US"/>
+        </w:rPr>
+      </w:pPr>
+      <w:r>
+        <w:rPr>
+          <w:lang w:val="en-US"/>
+        </w:rPr>
+        <w:t>It inserts </w:t>
+      </w:r>
+      <w:proofErr w:type="spellStart"/>
+      <w:r>
+        <w:rPr>
+          <w:lang w:val="en-US"/>
+        </w:rPr>
+        <w:t>QuantizeLinear</w:t>
+      </w:r>
+      <w:proofErr w:type="spellEnd"/>
+      <w:r>
+        <w:rPr>
+          <w:lang w:val="en-US"/>
+        </w:rPr>
+        <w:t> and </w:t>
+      </w:r>
+      <w:proofErr w:type="spellStart"/>
+      <w:r>
+        <w:rPr>
+          <w:lang w:val="en-US"/>
+        </w:rPr>
+        <w:t>DequantizeLinear</w:t>
+      </w:r>
+      <w:proofErr w:type="spellEnd"/>
+      <w:r>
+        <w:rPr>
+          <w:lang w:val="en-US"/>
+        </w:rPr>
+        <w:t> (QDQ) nodes around weights </w:t>
+      </w:r>
+      <w:r>
+        <w:rPr>
+          <w:i/>
+          <w:iCs/>
+          <w:lang w:val="en-US"/>
+        </w:rPr>
+        <w:t>and</w:t>
+      </w:r>
+      <w:r>
+        <w:rPr>
+          <w:lang w:val="en-US"/>
+        </w:rPr>
+        <w:t> activations.</w:t>
+      </w:r>
+    </w:p>
+    <w:p>
+      <w:pPr>
+        <w:numPr>
+          <w:ilvl w:val="1"/>
+          <w:numId w:val="9"/>
+        </w:numPr>
+        <w:rPr>
+          <w:lang w:val="en-US"/>
+        </w:rPr>
+      </w:pPr>
+      <w:r>
+        <w:rPr>
+          <w:lang w:val="en-US"/>
+        </w:rPr>
+        <w:t>The quantization parameters (scale/zero-point) are calculated </w:t>
+      </w:r>
+      <w:r>
+        <w:rPr>
+          <w:i/>
+          <w:iCs/>
+          <w:lang w:val="en-US"/>
+        </w:rPr>
+        <w:t>offline</w:t>
+      </w:r>
+      <w:r>
+        <w:rPr>
+          <w:lang w:val="en-US"/>
+        </w:rPr>
+        <w:t> and embedded in the graph via these QDQ nodes.</w:t>
+      </w:r>
+    </w:p>
+    <w:p>
+      <w:pPr>
+        <w:numPr>
+          <w:ilvl w:val="1"/>
+          <w:numId w:val="9"/>
+        </w:numPr>
+        <w:rPr>
+          <w:lang w:val="en-US"/>
+        </w:rPr>
+      </w:pPr>
+      <w:r>
+        <w:rPr>
+          <w:lang w:val="en-US"/>
+        </w:rPr>
+        <w:lastRenderedPageBreak/>
+        <w:t xml:space="preserve">The runtime then uses specialized kernels (e.g., NVIDIA's FP8/INT4 support in </w:t>
+      </w:r>
+      <w:proofErr w:type="spellStart"/>
+      <w:r>
+        <w:rPr>
+          <w:lang w:val="en-US"/>
+        </w:rPr>
+        <w:t>TensorRT</w:t>
+      </w:r>
+      <w:proofErr w:type="spellEnd"/>
+      <w:r>
+        <w:rPr>
+          <w:lang w:val="en-US"/>
+        </w:rPr>
+        <w:t xml:space="preserve"> Execution Provider, specific CPU instructions) that understand the QDQ format and can execute the operations efficiently.</w:t>
+      </w:r>
+    </w:p>
+    <w:p>
+      <w:pPr>
+        <w:numPr>
+          <w:ilvl w:val="1"/>
+          <w:numId w:val="9"/>
+        </w:numPr>
+        <w:rPr>
+          <w:lang w:val="en-US"/>
+        </w:rPr>
+      </w:pPr>
+      <w:r>
+        <w:rPr>
+          <w:b/>
+          <w:bCs/>
+          <w:lang w:val="en-US"/>
+        </w:rPr>
+        <w:t>This is </w:t>
+      </w:r>
+      <w:r>
+        <w:rPr>
+          <w:b/>
+          <w:bCs/>
+          <w:i/>
+          <w:iCs/>
+          <w:lang w:val="en-US"/>
+        </w:rPr>
+        <w:t>not</w:t>
+      </w:r>
+      <w:r>
+        <w:rPr>
+          <w:b/>
+          <w:bCs/>
+          <w:lang w:val="en-US"/>
+        </w:rPr>
+        <w:t> dynamic quantization.</w:t>
+      </w:r>
+      <w:r>
+        <w:rPr>
+          <w:lang w:val="en-US"/>
+        </w:rPr>
+        <w:t> Activations are quantized using pre-determined static ranges found during calibration.</w:t>
+      </w:r>
+    </w:p>
+    <w:p>
+      <w:pPr>
+        <w:rPr>
+          <w:lang w:val="en-US"/>
+        </w:rPr>
+      </w:pPr>
+    </w:p>
+    <w:p>
+      <w:pPr>
+        <w:rPr>
+          <w:lang w:val="en-US"/>
+        </w:rPr>
+      </w:pPr>
+    </w:p>
+    <w:p>
+      <w:pPr>
+        <w:rPr>
+          <w:lang w:val="en-US"/>
+        </w:rPr>
+      </w:pPr>
+    </w:p>
+    <w:p>
+      <w:pPr>
+        <w:rPr>
+          <w:lang w:val="en-US"/>
+        </w:rPr>
+      </w:pPr>
+    </w:p>
+    <w:p>
+      <w:pPr>
+        <w:rPr>
+          <w:lang w:val="en-US"/>
+        </w:rPr>
+      </w:pPr>
+    </w:p>
+    <w:p>
+      <w:pPr>
+        <w:rPr>
+          <w:lang w:val="en-US"/>
+        </w:rPr>
+      </w:pPr>
+    </w:p>
+    <w:p>
+      <w:pPr>
+        <w:rPr>
+          <w:lang w:val="en-US"/>
+        </w:rPr>
+      </w:pPr>
+    </w:p>
+    <w:p>
+      <w:pPr>
+        <w:rPr>
+          <w:lang w:val="en-US"/>
+        </w:rPr>
+      </w:pPr>
+    </w:p>
+    <w:p>
+      <w:pPr>
+        <w:rPr>
+          <w:lang w:val="en-US"/>
+        </w:rPr>
+      </w:pPr>
+    </w:p>
+    <w:p>
+      <w:pPr>
+        <w:rPr>
+          <w:lang w:val="en-US"/>
+        </w:rPr>
+      </w:pPr>
+    </w:p>
+    <w:p>
+      <w:pPr>
+        <w:rPr>
+          <w:lang w:val="en-US"/>
+        </w:rPr>
+      </w:pPr>
+    </w:p>
+    <w:p>
+      <w:pPr>
+        <w:rPr>
+          <w:lang w:val="en-US"/>
+        </w:rPr>
+      </w:pPr>
+    </w:p>
+    <w:p>
+      <w:pPr>
+        <w:rPr>
+          <w:lang w:val="en-US"/>
+        </w:rPr>
+      </w:pPr>
+    </w:p>
+    <w:p>
+      <w:pPr>
+        <w:rPr>
+          <w:lang w:val="en-US"/>
+        </w:rPr>
+      </w:pPr>
+    </w:p>
+    <w:p>
+      <w:pPr>
+        <w:rPr>
+          <w:lang w:val="en-US"/>
+        </w:rPr>
+      </w:pPr>
+    </w:p>
+    <w:p>
+      <w:pPr>
+        <w:rPr>
+          <w:lang w:val="en-US"/>
+        </w:rPr>
+      </w:pPr>
+    </w:p>
+    <w:p>
+      <w:pPr>
+        <w:rPr>
+          <w:lang w:val="en-US"/>
+        </w:rPr>
+      </w:pPr>
+    </w:p>
+    <w:p>
+      <w:pPr>
+        <w:rPr>
+          <w:lang w:val="en-US"/>
+        </w:rPr>
+      </w:pPr>
+    </w:p>
+    <w:p>
+      <w:pPr>
+        <w:rPr>
+          <w:lang w:val="en-US"/>
+        </w:rPr>
+      </w:pPr>
+    </w:p>
+    <w:p>
+      <w:pPr>
+        <w:rPr>
+          <w:lang w:val="en-US"/>
+        </w:rPr>
+      </w:pPr>
+    </w:p>
+    <w:p>
+      <w:pPr>
+        <w:rPr>
+          <w:lang w:val="en-US"/>
+        </w:rPr>
+      </w:pPr>
+    </w:p>
+    <w:p>
+      <w:pPr>
+        <w:rPr>
+          <w:lang w:val="en-US"/>
+        </w:rPr>
+      </w:pPr>
+    </w:p>
+    <w:p>
+      <w:pPr>
+        <w:rPr>
+          <w:lang w:val="en-US"/>
+        </w:rPr>
+      </w:pPr>
+    </w:p>
+    <w:p>
+      <w:pPr>
+        <w:rPr>
+          <w:lang w:val="en-US"/>
+        </w:rPr>
+      </w:pPr>
+    </w:p>
+    <w:p>
+      <w:pPr>
+        <w:rPr>
+          <w:lang w:val="en-US"/>
+        </w:rPr>
+      </w:pPr>
+    </w:p>
+    <w:p>
+      <w:pPr>
+        <w:rPr>
+          <w:b/>
+          <w:bCs/>
+          <w:color w:val="000000" w:themeColor="text1"/>
+          <w:lang w:val="en-US"/>
+        </w:rPr>
+      </w:pPr>
+      <w:r>
+        <w:rPr>
+          <w:lang w:val="en-US"/>
+        </w:rPr>
+        <w:lastRenderedPageBreak/>
+        <w:t xml:space="preserve">Check </w:t>
+      </w:r>
+      <w:proofErr w:type="spellStart"/>
+      <w:r>
+        <w:rPr>
+          <w:lang w:val="en-US"/>
+        </w:rPr>
+        <w:t>quantize_dynamic</w:t>
+      </w:r>
+      <w:proofErr w:type="spellEnd"/>
+      <w:r>
+        <w:rPr>
+          <w:lang w:val="en-US"/>
+        </w:rPr>
+        <w:t xml:space="preserve"> and </w:t>
+      </w:r>
+      <w:proofErr w:type="spellStart"/>
+      <w:r>
+        <w:rPr>
+          <w:lang w:val="en-US"/>
+        </w:rPr>
+        <w:t>quantize_static</w:t>
+      </w:r>
+      <w:proofErr w:type="spellEnd"/>
+      <w:r>
+        <w:rPr>
+          <w:lang w:val="en-US"/>
+        </w:rPr>
+        <w:t xml:space="preserve"> parameters</w:t>
+      </w:r>
     </w:p>
     <w:sectPr>
       <w:pgSz w:w="11906" w:h="16838"/>
@@ -1403,6 +5084,119 @@
 <file path=word/numbering.xml><?xml version="1.0" encoding="utf-8"?>
 <w:numbering xmlns:wpc="http://schemas.microsoft.com/office/word/2010/wordprocessingCanvas" xmlns:cx="http://schemas.microsoft.com/office/drawing/2014/chartex" xmlns:cx1="http://schemas.microsoft.com/office/drawing/2015/9/8/chartex" xmlns:cx2="http://schemas.microsoft.com/office/drawing/2015/10/21/chartex" xmlns:cx3="http://schemas.microsoft.com/office/drawing/2016/5/9/chartex" xmlns:cx4="http://schemas.microsoft.com/office/drawing/2016/5/10/chartex" xmlns:cx5="http://schemas.microsoft.com/office/drawing/2016/5/11/chartex" xmlns:cx6="http://schemas.microsoft.com/office/drawing/2016/5/12/chartex" xmlns:cx7="http://schemas.microsoft.com/office/drawing/2016/5/13/chartex" xmlns:cx8="http://schemas.microsoft.com/office/drawing/2016/5/14/chartex" xmlns:mc="http://schemas.openxmlformats.org/markup-compatibility/2006" xmlns:aink="http://schemas.microsoft.com/office/drawing/2016/ink" xmlns:am3d="http://schemas.microsoft.com/office/drawing/2017/model3d" xmlns:o="urn:schemas-microsoft-com:office:office" xmlns:oel="http://schemas.microsoft.com/office/2019/extlst" xmlns:r="http://schemas.openxmlformats.org/officeDocument/2006/relationships" xmlns:m="http://schemas.openxmlformats.org/officeDocument/2006/math" xmlns:v="urn:schemas-microsoft-com:vml" xmlns:wp14="http://schemas.microsoft.com/office/word/2010/wordprocessingDrawing" xmlns:wp="http://schemas.openxmlformats.org/drawingml/2006/wordprocessingDrawing" xmlns:w10="urn:schemas-microsoft-com:office:word" xmlns:w="http://schemas.openxmlformats.org/wordprocessingml/2006/main" xmlns:w14="http://schemas.microsoft.com/office/word/2010/wordml" xmlns:w15="http://schemas.microsoft.com/office/word/2012/wordml" xmlns:w16cex="http://schemas.microsoft.com/office/word/2018/wordml/cex" xmlns:w16cid="http://schemas.microsoft.com/office/word/2016/wordml/cid" xmlns:w16="http://schemas.microsoft.com/office/word/2018/wordml" xmlns:w16du="http://schemas.microsoft.com/office/word/2023/wordml/word16du" xmlns:w16sdtdh="http://schemas.microsoft.com/office/word/2020/wordml/sdtdatahash" xmlns:w16sdtfl="http://schemas.microsoft.com/office/word/2024/wordml/sdtformatlock" xmlns:w16se="http://schemas.microsoft.com/office/word/2015/wordml/symex" xmlns:wpg="http://schemas.microsoft.com/office/word/2010/wordprocessingGroup" xmlns:wpi="http://schemas.microsoft.com/office/word/2010/wordprocessingInk" xmlns:wne="http://schemas.microsoft.com/office/word/2006/wordml" xmlns:wps="http://schemas.microsoft.com/office/word/2010/wordprocessingShape" mc:Ignorable="w14 w15 w16se w16cid w16 w16cex w16sdtdh w16sdtfl w16du wp14">
   <w:abstractNum w:abstractNumId="0" w15:restartNumberingAfterBreak="0">
+    <w:nsid w:val="092E5C45"/>
+    <w:multiLevelType w:val="multilevel"/>
+    <w:tmpl w:val="2C88C70A"/>
+    <w:lvl w:ilvl="0">
+      <w:start w:val="1"/>
+      <w:numFmt w:val="decimal"/>
+      <w:lvlText w:val="%1."/>
+      <w:lvlJc w:val="left"/>
+      <w:pPr>
+        <w:tabs>
+          <w:tab w:val="num" w:pos="720"/>
+        </w:tabs>
+        <w:ind w:left="720" w:hanging="360"/>
+      </w:pPr>
+    </w:lvl>
+    <w:lvl w:ilvl="1" w:tentative="1">
+      <w:start w:val="1"/>
+      <w:numFmt w:val="decimal"/>
+      <w:lvlText w:val="%2."/>
+      <w:lvlJc w:val="left"/>
+      <w:pPr>
+        <w:tabs>
+          <w:tab w:val="num" w:pos="1440"/>
+        </w:tabs>
+        <w:ind w:left="1440" w:hanging="360"/>
+      </w:pPr>
+    </w:lvl>
+    <w:lvl w:ilvl="2" w:tentative="1">
+      <w:start w:val="1"/>
+      <w:numFmt w:val="decimal"/>
+      <w:lvlText w:val="%3."/>
+      <w:lvlJc w:val="left"/>
+      <w:pPr>
+        <w:tabs>
+          <w:tab w:val="num" w:pos="2160"/>
+        </w:tabs>
+        <w:ind w:left="2160" w:hanging="360"/>
+      </w:pPr>
+    </w:lvl>
+    <w:lvl w:ilvl="3" w:tentative="1">
+      <w:start w:val="1"/>
+      <w:numFmt w:val="decimal"/>
+      <w:lvlText w:val="%4."/>
+      <w:lvlJc w:val="left"/>
+      <w:pPr>
+        <w:tabs>
+          <w:tab w:val="num" w:pos="2880"/>
+        </w:tabs>
+        <w:ind w:left="2880" w:hanging="360"/>
+      </w:pPr>
+    </w:lvl>
+    <w:lvl w:ilvl="4" w:tentative="1">
+      <w:start w:val="1"/>
+      <w:numFmt w:val="decimal"/>
+      <w:lvlText w:val="%5."/>
+      <w:lvlJc w:val="left"/>
+      <w:pPr>
+        <w:tabs>
+          <w:tab w:val="num" w:pos="3600"/>
+        </w:tabs>
+        <w:ind w:left="3600" w:hanging="360"/>
+      </w:pPr>
+    </w:lvl>
+    <w:lvl w:ilvl="5" w:tentative="1">
+      <w:start w:val="1"/>
+      <w:numFmt w:val="decimal"/>
+      <w:lvlText w:val="%6."/>
+      <w:lvlJc w:val="left"/>
+      <w:pPr>
+        <w:tabs>
+          <w:tab w:val="num" w:pos="4320"/>
+        </w:tabs>
+        <w:ind w:left="4320" w:hanging="360"/>
+      </w:pPr>
+    </w:lvl>
+    <w:lvl w:ilvl="6" w:tentative="1">
+      <w:start w:val="1"/>
+      <w:numFmt w:val="decimal"/>
+      <w:lvlText w:val="%7."/>
+      <w:lvlJc w:val="left"/>
+      <w:pPr>
+        <w:tabs>
+          <w:tab w:val="num" w:pos="5040"/>
+        </w:tabs>
+        <w:ind w:left="5040" w:hanging="360"/>
+      </w:pPr>
+    </w:lvl>
+    <w:lvl w:ilvl="7" w:tentative="1">
+      <w:start w:val="1"/>
+      <w:numFmt w:val="decimal"/>
+      <w:lvlText w:val="%8."/>
+      <w:lvlJc w:val="left"/>
+      <w:pPr>
+        <w:tabs>
+          <w:tab w:val="num" w:pos="5760"/>
+        </w:tabs>
+        <w:ind w:left="5760" w:hanging="360"/>
+      </w:pPr>
+    </w:lvl>
+    <w:lvl w:ilvl="8" w:tentative="1">
+      <w:start w:val="1"/>
+      <w:numFmt w:val="decimal"/>
+      <w:lvlText w:val="%9."/>
+      <w:lvlJc w:val="left"/>
+      <w:pPr>
+        <w:tabs>
+          <w:tab w:val="num" w:pos="6480"/>
+        </w:tabs>
+        <w:ind w:left="6480" w:hanging="360"/>
+      </w:pPr>
+    </w:lvl>
+  </w:abstractNum>
+  <w:abstractNum w:abstractNumId="1" w15:restartNumberingAfterBreak="0">
     <w:nsid w:val="0A104179"/>
     <w:multiLevelType w:val="multilevel"/>
     <w:tmpl w:val="1DFE056C"/>
@@ -1515,7 +5309,7 @@
       </w:pPr>
     </w:lvl>
   </w:abstractNum>
-  <w:abstractNum w:abstractNumId="1" w15:restartNumberingAfterBreak="0">
+  <w:abstractNum w:abstractNumId="2" w15:restartNumberingAfterBreak="0">
     <w:nsid w:val="2805017A"/>
     <w:multiLevelType w:val="multilevel"/>
     <w:tmpl w:val="A6606304"/>
@@ -1664,7 +5458,277 @@
       </w:rPr>
     </w:lvl>
   </w:abstractNum>
-  <w:abstractNum w:abstractNumId="2" w15:restartNumberingAfterBreak="0">
+  <w:abstractNum w:abstractNumId="3" w15:restartNumberingAfterBreak="0">
+    <w:nsid w:val="3F735830"/>
+    <w:multiLevelType w:val="multilevel"/>
+    <w:tmpl w:val="F3F808A8"/>
+    <w:lvl w:ilvl="0">
+      <w:start w:val="1"/>
+      <w:numFmt w:val="bullet"/>
+      <w:lvlText w:val=""/>
+      <w:lvlJc w:val="left"/>
+      <w:pPr>
+        <w:tabs>
+          <w:tab w:val="num" w:pos="720"/>
+        </w:tabs>
+        <w:ind w:left="720" w:hanging="360"/>
+      </w:pPr>
+      <w:rPr>
+        <w:rFonts w:ascii="Symbol" w:hAnsi="Symbol" w:hint="default"/>
+        <w:sz w:val="20"/>
+      </w:rPr>
+    </w:lvl>
+    <w:lvl w:ilvl="1" w:tentative="1">
+      <w:start w:val="1"/>
+      <w:numFmt w:val="bullet"/>
+      <w:lvlText w:val="o"/>
+      <w:lvlJc w:val="left"/>
+      <w:pPr>
+        <w:tabs>
+          <w:tab w:val="num" w:pos="1440"/>
+        </w:tabs>
+        <w:ind w:left="1440" w:hanging="360"/>
+      </w:pPr>
+      <w:rPr>
+        <w:rFonts w:ascii="Courier New" w:hAnsi="Courier New" w:hint="default"/>
+        <w:sz w:val="20"/>
+      </w:rPr>
+    </w:lvl>
+    <w:lvl w:ilvl="2" w:tentative="1">
+      <w:start w:val="1"/>
+      <w:numFmt w:val="bullet"/>
+      <w:lvlText w:val=""/>
+      <w:lvlJc w:val="left"/>
+      <w:pPr>
+        <w:tabs>
+          <w:tab w:val="num" w:pos="2160"/>
+        </w:tabs>
+        <w:ind w:left="2160" w:hanging="360"/>
+      </w:pPr>
+      <w:rPr>
+        <w:rFonts w:ascii="Wingdings" w:hAnsi="Wingdings" w:hint="default"/>
+        <w:sz w:val="20"/>
+      </w:rPr>
+    </w:lvl>
+    <w:lvl w:ilvl="3" w:tentative="1">
+      <w:start w:val="1"/>
+      <w:numFmt w:val="bullet"/>
+      <w:lvlText w:val=""/>
+      <w:lvlJc w:val="left"/>
+      <w:pPr>
+        <w:tabs>
+          <w:tab w:val="num" w:pos="2880"/>
+        </w:tabs>
+        <w:ind w:left="2880" w:hanging="360"/>
+      </w:pPr>
+      <w:rPr>
+        <w:rFonts w:ascii="Wingdings" w:hAnsi="Wingdings" w:hint="default"/>
+        <w:sz w:val="20"/>
+      </w:rPr>
+    </w:lvl>
+    <w:lvl w:ilvl="4" w:tentative="1">
+      <w:start w:val="1"/>
+      <w:numFmt w:val="bullet"/>
+      <w:lvlText w:val=""/>
+      <w:lvlJc w:val="left"/>
+      <w:pPr>
+        <w:tabs>
+          <w:tab w:val="num" w:pos="3600"/>
+        </w:tabs>
+        <w:ind w:left="3600" w:hanging="360"/>
+      </w:pPr>
+      <w:rPr>
+        <w:rFonts w:ascii="Wingdings" w:hAnsi="Wingdings" w:hint="default"/>
+        <w:sz w:val="20"/>
+      </w:rPr>
+    </w:lvl>
+    <w:lvl w:ilvl="5" w:tentative="1">
+      <w:start w:val="1"/>
+      <w:numFmt w:val="bullet"/>
+      <w:lvlText w:val=""/>
+      <w:lvlJc w:val="left"/>
+      <w:pPr>
+        <w:tabs>
+          <w:tab w:val="num" w:pos="4320"/>
+        </w:tabs>
+        <w:ind w:left="4320" w:hanging="360"/>
+      </w:pPr>
+      <w:rPr>
+        <w:rFonts w:ascii="Wingdings" w:hAnsi="Wingdings" w:hint="default"/>
+        <w:sz w:val="20"/>
+      </w:rPr>
+    </w:lvl>
+    <w:lvl w:ilvl="6" w:tentative="1">
+      <w:start w:val="1"/>
+      <w:numFmt w:val="bullet"/>
+      <w:lvlText w:val=""/>
+      <w:lvlJc w:val="left"/>
+      <w:pPr>
+        <w:tabs>
+          <w:tab w:val="num" w:pos="5040"/>
+        </w:tabs>
+        <w:ind w:left="5040" w:hanging="360"/>
+      </w:pPr>
+      <w:rPr>
+        <w:rFonts w:ascii="Wingdings" w:hAnsi="Wingdings" w:hint="default"/>
+        <w:sz w:val="20"/>
+      </w:rPr>
+    </w:lvl>
+    <w:lvl w:ilvl="7" w:tentative="1">
+      <w:start w:val="1"/>
+      <w:numFmt w:val="bullet"/>
+      <w:lvlText w:val=""/>
+      <w:lvlJc w:val="left"/>
+      <w:pPr>
+        <w:tabs>
+          <w:tab w:val="num" w:pos="5760"/>
+        </w:tabs>
+        <w:ind w:left="5760" w:hanging="360"/>
+      </w:pPr>
+      <w:rPr>
+        <w:rFonts w:ascii="Wingdings" w:hAnsi="Wingdings" w:hint="default"/>
+        <w:sz w:val="20"/>
+      </w:rPr>
+    </w:lvl>
+    <w:lvl w:ilvl="8" w:tentative="1">
+      <w:start w:val="1"/>
+      <w:numFmt w:val="bullet"/>
+      <w:lvlText w:val=""/>
+      <w:lvlJc w:val="left"/>
+      <w:pPr>
+        <w:tabs>
+          <w:tab w:val="num" w:pos="6480"/>
+        </w:tabs>
+        <w:ind w:left="6480" w:hanging="360"/>
+      </w:pPr>
+      <w:rPr>
+        <w:rFonts w:ascii="Wingdings" w:hAnsi="Wingdings" w:hint="default"/>
+        <w:sz w:val="20"/>
+      </w:rPr>
+    </w:lvl>
+  </w:abstractNum>
+  <w:abstractNum w:abstractNumId="4" w15:restartNumberingAfterBreak="0">
+    <w:nsid w:val="60277936"/>
+    <w:multiLevelType w:val="multilevel"/>
+    <w:tmpl w:val="ACACE0BC"/>
+    <w:lvl w:ilvl="0">
+      <w:start w:val="1"/>
+      <w:numFmt w:val="decimal"/>
+      <w:lvlText w:val="%1."/>
+      <w:lvlJc w:val="left"/>
+      <w:pPr>
+        <w:tabs>
+          <w:tab w:val="num" w:pos="720"/>
+        </w:tabs>
+        <w:ind w:left="720" w:hanging="360"/>
+      </w:pPr>
+    </w:lvl>
+    <w:lvl w:ilvl="1">
+      <w:start w:val="1"/>
+      <w:numFmt w:val="bullet"/>
+      <w:lvlText w:val="o"/>
+      <w:lvlJc w:val="left"/>
+      <w:pPr>
+        <w:tabs>
+          <w:tab w:val="num" w:pos="1440"/>
+        </w:tabs>
+        <w:ind w:left="1440" w:hanging="360"/>
+      </w:pPr>
+      <w:rPr>
+        <w:rFonts w:ascii="Courier New" w:hAnsi="Courier New" w:hint="default"/>
+        <w:sz w:val="20"/>
+      </w:rPr>
+    </w:lvl>
+    <w:lvl w:ilvl="2">
+      <w:start w:val="1"/>
+      <w:numFmt w:val="bullet"/>
+      <w:lvlText w:val=""/>
+      <w:lvlJc w:val="left"/>
+      <w:pPr>
+        <w:tabs>
+          <w:tab w:val="num" w:pos="2160"/>
+        </w:tabs>
+        <w:ind w:left="2160" w:hanging="360"/>
+      </w:pPr>
+      <w:rPr>
+        <w:rFonts w:ascii="Wingdings" w:hAnsi="Wingdings" w:hint="default"/>
+        <w:sz w:val="20"/>
+      </w:rPr>
+    </w:lvl>
+    <w:lvl w:ilvl="3" w:tentative="1">
+      <w:start w:val="1"/>
+      <w:numFmt w:val="decimal"/>
+      <w:lvlText w:val="%4."/>
+      <w:lvlJc w:val="left"/>
+      <w:pPr>
+        <w:tabs>
+          <w:tab w:val="num" w:pos="2880"/>
+        </w:tabs>
+        <w:ind w:left="2880" w:hanging="360"/>
+      </w:pPr>
+    </w:lvl>
+    <w:lvl w:ilvl="4" w:tentative="1">
+      <w:start w:val="1"/>
+      <w:numFmt w:val="decimal"/>
+      <w:lvlText w:val="%5."/>
+      <w:lvlJc w:val="left"/>
+      <w:pPr>
+        <w:tabs>
+          <w:tab w:val="num" w:pos="3600"/>
+        </w:tabs>
+        <w:ind w:left="3600" w:hanging="360"/>
+      </w:pPr>
+    </w:lvl>
+    <w:lvl w:ilvl="5" w:tentative="1">
+      <w:start w:val="1"/>
+      <w:numFmt w:val="decimal"/>
+      <w:lvlText w:val="%6."/>
+      <w:lvlJc w:val="left"/>
+      <w:pPr>
+        <w:tabs>
+          <w:tab w:val="num" w:pos="4320"/>
+        </w:tabs>
+        <w:ind w:left="4320" w:hanging="360"/>
+      </w:pPr>
+    </w:lvl>
+    <w:lvl w:ilvl="6" w:tentative="1">
+      <w:start w:val="1"/>
+      <w:numFmt w:val="decimal"/>
+      <w:lvlText w:val="%7."/>
+      <w:lvlJc w:val="left"/>
+      <w:pPr>
+        <w:tabs>
+          <w:tab w:val="num" w:pos="5040"/>
+        </w:tabs>
+        <w:ind w:left="5040" w:hanging="360"/>
+      </w:pPr>
+    </w:lvl>
+    <w:lvl w:ilvl="7" w:tentative="1">
+      <w:start w:val="1"/>
+      <w:numFmt w:val="decimal"/>
+      <w:lvlText w:val="%8."/>
+      <w:lvlJc w:val="left"/>
+      <w:pPr>
+        <w:tabs>
+          <w:tab w:val="num" w:pos="5760"/>
+        </w:tabs>
+        <w:ind w:left="5760" w:hanging="360"/>
+      </w:pPr>
+    </w:lvl>
+    <w:lvl w:ilvl="8" w:tentative="1">
+      <w:start w:val="1"/>
+      <w:numFmt w:val="decimal"/>
+      <w:lvlText w:val="%9."/>
+      <w:lvlJc w:val="left"/>
+      <w:pPr>
+        <w:tabs>
+          <w:tab w:val="num" w:pos="6480"/>
+        </w:tabs>
+        <w:ind w:left="6480" w:hanging="360"/>
+      </w:pPr>
+    </w:lvl>
+  </w:abstractNum>
+  <w:abstractNum w:abstractNumId="5" w15:restartNumberingAfterBreak="0">
     <w:nsid w:val="63B845C3"/>
     <w:multiLevelType w:val="multilevel"/>
     <w:tmpl w:val="1C622CF2"/>
@@ -1781,7 +5845,7 @@
       </w:pPr>
     </w:lvl>
   </w:abstractNum>
-  <w:abstractNum w:abstractNumId="3" w15:restartNumberingAfterBreak="0">
+  <w:abstractNum w:abstractNumId="6" w15:restartNumberingAfterBreak="0">
     <w:nsid w:val="67B67D48"/>
     <w:multiLevelType w:val="multilevel"/>
     <w:tmpl w:val="EC84400E"/>
@@ -1898,17 +5962,268 @@
       </w:pPr>
     </w:lvl>
   </w:abstractNum>
+  <w:abstractNum w:abstractNumId="7" w15:restartNumberingAfterBreak="0">
+    <w:nsid w:val="6BE4659E"/>
+    <w:multiLevelType w:val="multilevel"/>
+    <w:tmpl w:val="50B245D4"/>
+    <w:lvl w:ilvl="0">
+      <w:start w:val="1"/>
+      <w:numFmt w:val="decimal"/>
+      <w:lvlText w:val="%1."/>
+      <w:lvlJc w:val="left"/>
+      <w:pPr>
+        <w:tabs>
+          <w:tab w:val="num" w:pos="720"/>
+        </w:tabs>
+        <w:ind w:left="720" w:hanging="360"/>
+      </w:pPr>
+    </w:lvl>
+    <w:lvl w:ilvl="1">
+      <w:start w:val="1"/>
+      <w:numFmt w:val="bullet"/>
+      <w:lvlText w:val="o"/>
+      <w:lvlJc w:val="left"/>
+      <w:pPr>
+        <w:tabs>
+          <w:tab w:val="num" w:pos="1440"/>
+        </w:tabs>
+        <w:ind w:left="1440" w:hanging="360"/>
+      </w:pPr>
+      <w:rPr>
+        <w:rFonts w:ascii="Courier New" w:hAnsi="Courier New" w:hint="default"/>
+        <w:sz w:val="20"/>
+      </w:rPr>
+    </w:lvl>
+    <w:lvl w:ilvl="2" w:tentative="1">
+      <w:start w:val="1"/>
+      <w:numFmt w:val="decimal"/>
+      <w:lvlText w:val="%3."/>
+      <w:lvlJc w:val="left"/>
+      <w:pPr>
+        <w:tabs>
+          <w:tab w:val="num" w:pos="2160"/>
+        </w:tabs>
+        <w:ind w:left="2160" w:hanging="360"/>
+      </w:pPr>
+    </w:lvl>
+    <w:lvl w:ilvl="3" w:tentative="1">
+      <w:start w:val="1"/>
+      <w:numFmt w:val="decimal"/>
+      <w:lvlText w:val="%4."/>
+      <w:lvlJc w:val="left"/>
+      <w:pPr>
+        <w:tabs>
+          <w:tab w:val="num" w:pos="2880"/>
+        </w:tabs>
+        <w:ind w:left="2880" w:hanging="360"/>
+      </w:pPr>
+    </w:lvl>
+    <w:lvl w:ilvl="4" w:tentative="1">
+      <w:start w:val="1"/>
+      <w:numFmt w:val="decimal"/>
+      <w:lvlText w:val="%5."/>
+      <w:lvlJc w:val="left"/>
+      <w:pPr>
+        <w:tabs>
+          <w:tab w:val="num" w:pos="3600"/>
+        </w:tabs>
+        <w:ind w:left="3600" w:hanging="360"/>
+      </w:pPr>
+    </w:lvl>
+    <w:lvl w:ilvl="5" w:tentative="1">
+      <w:start w:val="1"/>
+      <w:numFmt w:val="decimal"/>
+      <w:lvlText w:val="%6."/>
+      <w:lvlJc w:val="left"/>
+      <w:pPr>
+        <w:tabs>
+          <w:tab w:val="num" w:pos="4320"/>
+        </w:tabs>
+        <w:ind w:left="4320" w:hanging="360"/>
+      </w:pPr>
+    </w:lvl>
+    <w:lvl w:ilvl="6" w:tentative="1">
+      <w:start w:val="1"/>
+      <w:numFmt w:val="decimal"/>
+      <w:lvlText w:val="%7."/>
+      <w:lvlJc w:val="left"/>
+      <w:pPr>
+        <w:tabs>
+          <w:tab w:val="num" w:pos="5040"/>
+        </w:tabs>
+        <w:ind w:left="5040" w:hanging="360"/>
+      </w:pPr>
+    </w:lvl>
+    <w:lvl w:ilvl="7" w:tentative="1">
+      <w:start w:val="1"/>
+      <w:numFmt w:val="decimal"/>
+      <w:lvlText w:val="%8."/>
+      <w:lvlJc w:val="left"/>
+      <w:pPr>
+        <w:tabs>
+          <w:tab w:val="num" w:pos="5760"/>
+        </w:tabs>
+        <w:ind w:left="5760" w:hanging="360"/>
+      </w:pPr>
+    </w:lvl>
+    <w:lvl w:ilvl="8" w:tentative="1">
+      <w:start w:val="1"/>
+      <w:numFmt w:val="decimal"/>
+      <w:lvlText w:val="%9."/>
+      <w:lvlJc w:val="left"/>
+      <w:pPr>
+        <w:tabs>
+          <w:tab w:val="num" w:pos="6480"/>
+        </w:tabs>
+        <w:ind w:left="6480" w:hanging="360"/>
+      </w:pPr>
+    </w:lvl>
+  </w:abstractNum>
+  <w:abstractNum w:abstractNumId="8" w15:restartNumberingAfterBreak="0">
+    <w:nsid w:val="6E9B123E"/>
+    <w:multiLevelType w:val="multilevel"/>
+    <w:tmpl w:val="79ECE7B4"/>
+    <w:lvl w:ilvl="0">
+      <w:start w:val="1"/>
+      <w:numFmt w:val="bullet"/>
+      <w:lvlText w:val=""/>
+      <w:lvlJc w:val="left"/>
+      <w:pPr>
+        <w:tabs>
+          <w:tab w:val="num" w:pos="720"/>
+        </w:tabs>
+        <w:ind w:left="720" w:hanging="360"/>
+      </w:pPr>
+      <w:rPr>
+        <w:rFonts w:ascii="Wingdings" w:hAnsi="Wingdings" w:hint="default"/>
+      </w:rPr>
+    </w:lvl>
+    <w:lvl w:ilvl="1">
+      <w:start w:val="1"/>
+      <w:numFmt w:val="bullet"/>
+      <w:lvlText w:val="o"/>
+      <w:lvlJc w:val="left"/>
+      <w:pPr>
+        <w:tabs>
+          <w:tab w:val="num" w:pos="1440"/>
+        </w:tabs>
+        <w:ind w:left="1440" w:hanging="360"/>
+      </w:pPr>
+      <w:rPr>
+        <w:rFonts w:ascii="Courier New" w:hAnsi="Courier New" w:hint="default"/>
+        <w:sz w:val="20"/>
+      </w:rPr>
+    </w:lvl>
+    <w:lvl w:ilvl="2">
+      <w:numFmt w:val="bullet"/>
+      <w:lvlText w:val=""/>
+      <w:lvlJc w:val="left"/>
+      <w:pPr>
+        <w:ind w:left="2160" w:hanging="360"/>
+      </w:pPr>
+      <w:rPr>
+        <w:rFonts w:ascii="Wingdings" w:eastAsiaTheme="minorHAnsi" w:hAnsi="Wingdings" w:cstheme="minorBidi" w:hint="default"/>
+      </w:rPr>
+    </w:lvl>
+    <w:lvl w:ilvl="3" w:tentative="1">
+      <w:start w:val="1"/>
+      <w:numFmt w:val="decimal"/>
+      <w:lvlText w:val="%4."/>
+      <w:lvlJc w:val="left"/>
+      <w:pPr>
+        <w:tabs>
+          <w:tab w:val="num" w:pos="2880"/>
+        </w:tabs>
+        <w:ind w:left="2880" w:hanging="360"/>
+      </w:pPr>
+    </w:lvl>
+    <w:lvl w:ilvl="4" w:tentative="1">
+      <w:start w:val="1"/>
+      <w:numFmt w:val="decimal"/>
+      <w:lvlText w:val="%5."/>
+      <w:lvlJc w:val="left"/>
+      <w:pPr>
+        <w:tabs>
+          <w:tab w:val="num" w:pos="3600"/>
+        </w:tabs>
+        <w:ind w:left="3600" w:hanging="360"/>
+      </w:pPr>
+    </w:lvl>
+    <w:lvl w:ilvl="5" w:tentative="1">
+      <w:start w:val="1"/>
+      <w:numFmt w:val="decimal"/>
+      <w:lvlText w:val="%6."/>
+      <w:lvlJc w:val="left"/>
+      <w:pPr>
+        <w:tabs>
+          <w:tab w:val="num" w:pos="4320"/>
+        </w:tabs>
+        <w:ind w:left="4320" w:hanging="360"/>
+      </w:pPr>
+    </w:lvl>
+    <w:lvl w:ilvl="6" w:tentative="1">
+      <w:start w:val="1"/>
+      <w:numFmt w:val="decimal"/>
+      <w:lvlText w:val="%7."/>
+      <w:lvlJc w:val="left"/>
+      <w:pPr>
+        <w:tabs>
+          <w:tab w:val="num" w:pos="5040"/>
+        </w:tabs>
+        <w:ind w:left="5040" w:hanging="360"/>
+      </w:pPr>
+    </w:lvl>
+    <w:lvl w:ilvl="7" w:tentative="1">
+      <w:start w:val="1"/>
+      <w:numFmt w:val="decimal"/>
+      <w:lvlText w:val="%8."/>
+      <w:lvlJc w:val="left"/>
+      <w:pPr>
+        <w:tabs>
+          <w:tab w:val="num" w:pos="5760"/>
+        </w:tabs>
+        <w:ind w:left="5760" w:hanging="360"/>
+      </w:pPr>
+    </w:lvl>
+    <w:lvl w:ilvl="8" w:tentative="1">
+      <w:start w:val="1"/>
+      <w:numFmt w:val="decimal"/>
+      <w:lvlText w:val="%9."/>
+      <w:lvlJc w:val="left"/>
+      <w:pPr>
+        <w:tabs>
+          <w:tab w:val="num" w:pos="6480"/>
+        </w:tabs>
+        <w:ind w:left="6480" w:hanging="360"/>
+      </w:pPr>
+    </w:lvl>
+  </w:abstractNum>
   <w:num w:numId="1" w16cid:durableId="1824541099">
+    <w:abstractNumId w:val="6"/>
+  </w:num>
+  <w:num w:numId="2" w16cid:durableId="1183981729">
+    <w:abstractNumId w:val="5"/>
+  </w:num>
+  <w:num w:numId="3" w16cid:durableId="951669135">
+    <w:abstractNumId w:val="1"/>
+  </w:num>
+  <w:num w:numId="4" w16cid:durableId="211890488">
+    <w:abstractNumId w:val="2"/>
+  </w:num>
+  <w:num w:numId="5" w16cid:durableId="644314484">
+    <w:abstractNumId w:val="4"/>
+  </w:num>
+  <w:num w:numId="6" w16cid:durableId="655692330">
     <w:abstractNumId w:val="3"/>
   </w:num>
-  <w:num w:numId="2" w16cid:durableId="1183981729">
-    <w:abstractNumId w:val="2"/>
+  <w:num w:numId="7" w16cid:durableId="387728033">
+    <w:abstractNumId w:val="7"/>
   </w:num>
-  <w:num w:numId="3" w16cid:durableId="951669135">
+  <w:num w:numId="8" w16cid:durableId="1130324157">
     <w:abstractNumId w:val="0"/>
   </w:num>
-  <w:num w:numId="4" w16cid:durableId="211890488">
-    <w:abstractNumId w:val="1"/>
+  <w:num w:numId="9" w16cid:durableId="2112042386">
+    <w:abstractNumId w:val="8"/>
   </w:num>
 </w:numbering>
 </file>

</xml_diff>